<commit_message>
change in the document
</commit_message>
<xml_diff>
--- a/Documents/Website Proposal project.docx
+++ b/Documents/Website Proposal project.docx
@@ -1157,9 +1157,20 @@
     <w:p>
       <w:pPr>
         <w:pStyle w:val="Heading1"/>
+        <w:spacing w:line="360" w:lineRule="auto"/>
+        <w:rPr>
+          <w:rFonts w:ascii="Aptos" w:hAnsi="Aptos"/>
+          <w:sz w:val="22"/>
+          <w:szCs w:val="22"/>
+        </w:rPr>
       </w:pPr>
       <w:bookmarkStart w:id="0" w:name="_Toc227224106"/>
       <w:r>
+        <w:rPr>
+          <w:rFonts w:ascii="Aptos" w:hAnsi="Aptos"/>
+          <w:sz w:val="22"/>
+          <w:szCs w:val="22"/>
+        </w:rPr>
         <w:lastRenderedPageBreak/>
         <w:t>Proposal 1: Urban Brew Coffee Website</w:t>
       </w:r>
@@ -1168,97 +1179,234 @@
     <w:p>
       <w:pPr>
         <w:pStyle w:val="Heading2"/>
+        <w:spacing w:line="360" w:lineRule="auto"/>
+        <w:rPr>
+          <w:rFonts w:ascii="Aptos" w:hAnsi="Aptos"/>
+          <w:sz w:val="22"/>
+          <w:szCs w:val="22"/>
+        </w:rPr>
       </w:pPr>
       <w:bookmarkStart w:id="1" w:name="_Toc227224107"/>
       <w:r>
+        <w:rPr>
+          <w:rFonts w:ascii="Aptos" w:hAnsi="Aptos"/>
+          <w:sz w:val="22"/>
+          <w:szCs w:val="22"/>
+        </w:rPr>
         <w:t>1. Organization Overview</w:t>
       </w:r>
       <w:bookmarkEnd w:id="1"/>
     </w:p>
     <w:p>
+      <w:pPr>
+        <w:spacing w:line="360" w:lineRule="auto"/>
+        <w:rPr>
+          <w:rFonts w:ascii="Aptos" w:hAnsi="Aptos"/>
+        </w:rPr>
+      </w:pPr>
       <w:r>
+        <w:rPr>
+          <w:rFonts w:ascii="Aptos" w:hAnsi="Aptos"/>
+        </w:rPr>
         <w:t>Founded in 201</w:t>
       </w:r>
       <w:r>
+        <w:rPr>
+          <w:rFonts w:ascii="Aptos" w:hAnsi="Aptos"/>
+        </w:rPr>
         <w:t>9</w:t>
       </w:r>
       <w:r>
+        <w:rPr>
+          <w:rFonts w:ascii="Aptos" w:hAnsi="Aptos"/>
+        </w:rPr>
         <w:t>, Urban Brew Coffee is a stand-alone coffee store. It focuses on providing high-quality coffee items while establishing a calm and friendly atmosphere for clients. Through social media marketing and word-of-mouth, the company has steadily expanded.</w:t>
       </w:r>
       <w:r>
+        <w:rPr>
+          <w:rFonts w:ascii="Aptos" w:hAnsi="Aptos"/>
+        </w:rPr>
         <w:br/>
       </w:r>
       <w:r>
+        <w:rPr>
+          <w:rFonts w:ascii="Aptos" w:hAnsi="Aptos"/>
+        </w:rPr>
         <w:br/>
       </w:r>
       <w:r>
-        <w:t>Our mission is to provide outstanding service and superior coffee.                                       Vision: To become the area's top coffee destination.                                                              Students, young professionals, and remote workers between the ages of 18 and 40 are the target audience.</w:t>
+        <w:rPr>
+          <w:rFonts w:ascii="Aptos" w:hAnsi="Aptos"/>
+        </w:rPr>
+        <w:t xml:space="preserve">Our mission is to provide outstanding service and superior coffee.                                      </w:t>
+      </w:r>
+      <w:r>
+        <w:rPr>
+          <w:rFonts w:ascii="Aptos" w:hAnsi="Aptos"/>
+        </w:rPr>
+        <w:t xml:space="preserve">           </w:t>
+      </w:r>
+      <w:r>
+        <w:rPr>
+          <w:rFonts w:ascii="Aptos" w:hAnsi="Aptos"/>
+        </w:rPr>
+        <w:t xml:space="preserve"> Vision: To become the area's top coffee destination.                                                              </w:t>
+      </w:r>
+      <w:r>
+        <w:rPr>
+          <w:rFonts w:ascii="Aptos" w:hAnsi="Aptos"/>
+        </w:rPr>
+        <w:t xml:space="preserve">         </w:t>
+      </w:r>
+      <w:r>
+        <w:rPr>
+          <w:rFonts w:ascii="Aptos" w:hAnsi="Aptos"/>
+        </w:rPr>
+        <w:t>Students, young professionals, and remote workers between the ages of 18 and 40 are the target audience.</w:t>
       </w:r>
     </w:p>
     <w:p>
       <w:pPr>
         <w:pStyle w:val="Heading2"/>
+        <w:spacing w:line="360" w:lineRule="auto"/>
+        <w:rPr>
+          <w:rFonts w:ascii="Aptos" w:hAnsi="Aptos"/>
+          <w:sz w:val="22"/>
+          <w:szCs w:val="22"/>
+        </w:rPr>
       </w:pPr>
       <w:bookmarkStart w:id="2" w:name="_Toc227224108"/>
       <w:r>
+        <w:rPr>
+          <w:rFonts w:ascii="Aptos" w:hAnsi="Aptos"/>
+          <w:sz w:val="22"/>
+          <w:szCs w:val="22"/>
+        </w:rPr>
         <w:t>2. Website Goals and Objectives</w:t>
       </w:r>
       <w:bookmarkEnd w:id="2"/>
     </w:p>
     <w:p>
+      <w:pPr>
+        <w:spacing w:line="360" w:lineRule="auto"/>
+        <w:rPr>
+          <w:rFonts w:ascii="Aptos" w:hAnsi="Aptos"/>
+        </w:rPr>
+      </w:pPr>
       <w:r>
+        <w:rPr>
+          <w:rFonts w:ascii="Aptos" w:hAnsi="Aptos"/>
+        </w:rPr>
         <w:t>The website's objectives are to raise brand awareness, draw in new clients, and offer an online buying system. It will act as a focal point for promotions and information.</w:t>
       </w:r>
       <w:r>
+        <w:rPr>
+          <w:rFonts w:ascii="Aptos" w:hAnsi="Aptos"/>
+        </w:rPr>
         <w:br/>
       </w:r>
       <w:r>
-        <w:br/>
-      </w:r>
-      <w:r>
+        <w:rPr>
+          <w:rFonts w:ascii="Aptos" w:hAnsi="Aptos"/>
+        </w:rPr>
         <w:t>Increased traffic, online sales, and customer interaction indicators are examples of KPIs.</w:t>
       </w:r>
     </w:p>
     <w:p>
       <w:pPr>
         <w:pStyle w:val="Heading2"/>
+        <w:spacing w:line="360" w:lineRule="auto"/>
+        <w:rPr>
+          <w:rFonts w:ascii="Aptos" w:hAnsi="Aptos"/>
+          <w:sz w:val="22"/>
+          <w:szCs w:val="22"/>
+        </w:rPr>
       </w:pPr>
       <w:bookmarkStart w:id="3" w:name="_Toc227224109"/>
       <w:r>
+        <w:rPr>
+          <w:rFonts w:ascii="Aptos" w:hAnsi="Aptos"/>
+          <w:sz w:val="22"/>
+          <w:szCs w:val="22"/>
+        </w:rPr>
         <w:t>3. Current Website Analysis</w:t>
       </w:r>
       <w:bookmarkEnd w:id="3"/>
     </w:p>
     <w:p>
+      <w:pPr>
+        <w:spacing w:line="360" w:lineRule="auto"/>
+        <w:rPr>
+          <w:rFonts w:ascii="Aptos" w:hAnsi="Aptos"/>
+        </w:rPr>
+      </w:pPr>
       <w:r>
+        <w:rPr>
+          <w:rFonts w:ascii="Aptos" w:hAnsi="Aptos"/>
+        </w:rPr>
         <w:t>The company now uses social media and doesn't have a proper website. This restricts professionalism and accessibility.</w:t>
       </w:r>
       <w:r>
+        <w:rPr>
+          <w:rFonts w:ascii="Aptos" w:hAnsi="Aptos"/>
+        </w:rPr>
         <w:br/>
       </w:r>
       <w:r>
-        <w:br/>
-      </w:r>
-      <w:r>
+        <w:rPr>
+          <w:rFonts w:ascii="Aptos" w:hAnsi="Aptos"/>
+        </w:rPr>
         <w:t>Creating a responsive website with ordering features is one improvement.</w:t>
       </w:r>
     </w:p>
     <w:p>
       <w:pPr>
         <w:pStyle w:val="Heading2"/>
+        <w:spacing w:line="360" w:lineRule="auto"/>
+        <w:rPr>
+          <w:rFonts w:ascii="Aptos" w:hAnsi="Aptos"/>
+          <w:sz w:val="22"/>
+          <w:szCs w:val="22"/>
+        </w:rPr>
       </w:pPr>
       <w:bookmarkStart w:id="4" w:name="_Toc227224110"/>
       <w:r>
+        <w:rPr>
+          <w:rFonts w:ascii="Aptos" w:hAnsi="Aptos"/>
+          <w:sz w:val="22"/>
+          <w:szCs w:val="22"/>
+        </w:rPr>
         <w:t>4. Features and Functionality</w:t>
       </w:r>
       <w:bookmarkStart w:id="5" w:name="_Toc227224111"/>
       <w:bookmarkEnd w:id="4"/>
       <w:r>
-        <w:t xml:space="preserve">                                                                                            </w:t>
+        <w:rPr>
+          <w:rFonts w:ascii="Aptos" w:hAnsi="Aptos"/>
+          <w:sz w:val="22"/>
+          <w:szCs w:val="22"/>
+        </w:rPr>
+        <w:t xml:space="preserve">                                                                                           </w:t>
       </w:r>
       <w:r>
         <w:rPr>
-          <w:rFonts w:asciiTheme="minorHAnsi" w:eastAsiaTheme="minorEastAsia" w:hAnsiTheme="minorHAnsi" w:cstheme="minorBidi"/>
+          <w:rFonts w:ascii="Aptos" w:hAnsi="Aptos"/>
+          <w:sz w:val="22"/>
+          <w:szCs w:val="22"/>
+        </w:rPr>
+        <w:t xml:space="preserve">                                  </w:t>
+      </w:r>
+      <w:r>
+        <w:rPr>
+          <w:rFonts w:ascii="Aptos" w:hAnsi="Aptos"/>
+          <w:sz w:val="22"/>
+          <w:szCs w:val="22"/>
+        </w:rPr>
+        <w:t xml:space="preserve"> </w:t>
+      </w:r>
+      <w:r>
+        <w:rPr>
+          <w:rFonts w:ascii="Aptos" w:eastAsiaTheme="minorEastAsia" w:hAnsi="Aptos" w:cstheme="minorBidi"/>
           <w:b w:val="0"/>
           <w:bCs w:val="0"/>
           <w:color w:val="auto"/>
@@ -1269,7 +1417,7 @@
       </w:r>
       <w:r>
         <w:rPr>
-          <w:rFonts w:asciiTheme="minorHAnsi" w:eastAsiaTheme="minorEastAsia" w:hAnsiTheme="minorHAnsi" w:cstheme="minorBidi"/>
+          <w:rFonts w:ascii="Aptos" w:eastAsiaTheme="minorEastAsia" w:hAnsi="Aptos" w:cstheme="minorBidi"/>
           <w:b w:val="0"/>
           <w:bCs w:val="0"/>
           <w:color w:val="auto"/>
@@ -1280,7 +1428,7 @@
       </w:r>
       <w:r>
         <w:rPr>
-          <w:rFonts w:asciiTheme="minorHAnsi" w:eastAsiaTheme="minorEastAsia" w:hAnsiTheme="minorHAnsi" w:cstheme="minorBidi"/>
+          <w:rFonts w:ascii="Aptos" w:eastAsiaTheme="minorEastAsia" w:hAnsi="Aptos" w:cstheme="minorBidi"/>
           <w:b w:val="0"/>
           <w:bCs w:val="0"/>
           <w:color w:val="auto"/>
@@ -1293,17 +1441,41 @@
     <w:p>
       <w:pPr>
         <w:pStyle w:val="Heading1"/>
+        <w:spacing w:line="360" w:lineRule="auto"/>
+        <w:rPr>
+          <w:rFonts w:ascii="Aptos" w:hAnsi="Aptos"/>
+          <w:sz w:val="22"/>
+          <w:szCs w:val="22"/>
+        </w:rPr>
       </w:pPr>
       <w:r>
+        <w:rPr>
+          <w:rFonts w:ascii="Aptos" w:hAnsi="Aptos"/>
+          <w:sz w:val="22"/>
+          <w:szCs w:val="22"/>
+        </w:rPr>
         <w:t>5. Design and UX</w:t>
       </w:r>
       <w:bookmarkEnd w:id="5"/>
       <w:r>
+        <w:rPr>
+          <w:rFonts w:ascii="Aptos" w:hAnsi="Aptos"/>
+          <w:sz w:val="22"/>
+          <w:szCs w:val="22"/>
+        </w:rPr>
         <w:t xml:space="preserve">                                                                                                  </w:t>
       </w:r>
       <w:r>
         <w:rPr>
-          <w:rFonts w:asciiTheme="minorHAnsi" w:eastAsiaTheme="minorEastAsia" w:hAnsiTheme="minorHAnsi" w:cstheme="minorBidi"/>
+          <w:rFonts w:ascii="Aptos" w:hAnsi="Aptos"/>
+          <w:sz w:val="22"/>
+          <w:szCs w:val="22"/>
+        </w:rPr>
+        <w:t xml:space="preserve">                                               </w:t>
+      </w:r>
+      <w:r>
+        <w:rPr>
+          <w:rFonts w:ascii="Aptos" w:eastAsiaTheme="minorEastAsia" w:hAnsi="Aptos" w:cstheme="minorBidi"/>
           <w:b w:val="0"/>
           <w:bCs w:val="0"/>
           <w:color w:val="auto"/>
@@ -1313,24 +1485,54 @@
         <w:t>Warm colors like cream and brown will be used in the design to represent the company identity. The design will be straightforward, tidy, and easy to use. The navigation will be responsive to mobile devices and easy to use.</w:t>
       </w:r>
     </w:p>
-    <w:p/>
+    <w:p>
+      <w:pPr>
+        <w:spacing w:line="360" w:lineRule="auto"/>
+        <w:rPr>
+          <w:rFonts w:ascii="Aptos" w:hAnsi="Aptos"/>
+        </w:rPr>
+      </w:pPr>
+    </w:p>
     <w:p>
       <w:pPr>
         <w:pStyle w:val="Heading2"/>
+        <w:spacing w:line="360" w:lineRule="auto"/>
+        <w:rPr>
+          <w:rFonts w:ascii="Aptos" w:hAnsi="Aptos"/>
+          <w:sz w:val="22"/>
+          <w:szCs w:val="22"/>
+        </w:rPr>
       </w:pPr>
       <w:bookmarkStart w:id="6" w:name="_Toc227224112"/>
       <w:r>
+        <w:rPr>
+          <w:rFonts w:ascii="Aptos" w:hAnsi="Aptos"/>
+          <w:sz w:val="22"/>
+          <w:szCs w:val="22"/>
+        </w:rPr>
         <w:lastRenderedPageBreak/>
         <w:t xml:space="preserve">6. </w:t>
       </w:r>
       <w:r>
+        <w:rPr>
+          <w:rFonts w:ascii="Aptos" w:hAnsi="Aptos"/>
+          <w:sz w:val="22"/>
+          <w:szCs w:val="22"/>
+        </w:rPr>
         <w:t>Wireframe</w:t>
       </w:r>
       <w:bookmarkEnd w:id="6"/>
     </w:p>
     <w:p>
+      <w:pPr>
+        <w:spacing w:line="360" w:lineRule="auto"/>
+        <w:rPr>
+          <w:rFonts w:ascii="Aptos" w:hAnsi="Aptos"/>
+        </w:rPr>
+      </w:pPr>
       <w:r>
         <w:rPr>
+          <w:rFonts w:ascii="Aptos" w:hAnsi="Aptos"/>
           <w:noProof/>
         </w:rPr>
         <w:drawing>
@@ -1373,22 +1575,51 @@
     <w:p>
       <w:pPr>
         <w:pStyle w:val="Heading2"/>
+        <w:spacing w:line="360" w:lineRule="auto"/>
+        <w:rPr>
+          <w:rFonts w:ascii="Aptos" w:hAnsi="Aptos"/>
+          <w:sz w:val="22"/>
+          <w:szCs w:val="22"/>
+        </w:rPr>
       </w:pPr>
       <w:bookmarkStart w:id="7" w:name="_Toc227224113"/>
       <w:r>
+        <w:rPr>
+          <w:rFonts w:ascii="Aptos" w:hAnsi="Aptos"/>
+          <w:sz w:val="22"/>
+          <w:szCs w:val="22"/>
+        </w:rPr>
         <w:t>7</w:t>
       </w:r>
       <w:r>
+        <w:rPr>
+          <w:rFonts w:ascii="Aptos" w:hAnsi="Aptos"/>
+          <w:sz w:val="22"/>
+          <w:szCs w:val="22"/>
+        </w:rPr>
         <w:t>. Technical Requirements</w:t>
       </w:r>
       <w:bookmarkStart w:id="8" w:name="_Toc227224114"/>
       <w:bookmarkEnd w:id="7"/>
       <w:r>
+        <w:rPr>
+          <w:rFonts w:ascii="Aptos" w:hAnsi="Aptos"/>
+          <w:sz w:val="22"/>
+          <w:szCs w:val="22"/>
+        </w:rPr>
         <w:t xml:space="preserve">                                                                                           </w:t>
       </w:r>
       <w:r>
         <w:rPr>
-          <w:rFonts w:asciiTheme="minorHAnsi" w:eastAsiaTheme="minorEastAsia" w:hAnsiTheme="minorHAnsi" w:cstheme="minorBidi"/>
+          <w:rFonts w:ascii="Aptos" w:hAnsi="Aptos"/>
+          <w:sz w:val="22"/>
+          <w:szCs w:val="22"/>
+        </w:rPr>
+        <w:t xml:space="preserve">                                       </w:t>
+      </w:r>
+      <w:r>
+        <w:rPr>
+          <w:rFonts w:ascii="Aptos" w:eastAsiaTheme="minorEastAsia" w:hAnsi="Aptos" w:cstheme="minorBidi"/>
           <w:b w:val="0"/>
           <w:bCs w:val="0"/>
           <w:color w:val="auto"/>
@@ -1399,7 +1630,7 @@
       </w:r>
       <w:r>
         <w:rPr>
-          <w:rFonts w:asciiTheme="minorHAnsi" w:eastAsiaTheme="minorEastAsia" w:hAnsiTheme="minorHAnsi" w:cstheme="minorBidi"/>
+          <w:rFonts w:ascii="Aptos" w:eastAsiaTheme="minorEastAsia" w:hAnsi="Aptos" w:cstheme="minorBidi"/>
           <w:b w:val="0"/>
           <w:bCs w:val="0"/>
           <w:color w:val="auto"/>
@@ -1410,7 +1641,7 @@
       </w:r>
       <w:r>
         <w:rPr>
-          <w:rFonts w:asciiTheme="minorHAnsi" w:eastAsiaTheme="minorEastAsia" w:hAnsiTheme="minorHAnsi" w:cstheme="minorBidi"/>
+          <w:rFonts w:ascii="Aptos" w:eastAsiaTheme="minorEastAsia" w:hAnsi="Aptos" w:cstheme="minorBidi"/>
           <w:b w:val="0"/>
           <w:bCs w:val="0"/>
           <w:color w:val="auto"/>
@@ -1423,28 +1654,62 @@
     <w:p>
       <w:pPr>
         <w:pStyle w:val="Heading2"/>
+        <w:spacing w:line="360" w:lineRule="auto"/>
+        <w:rPr>
+          <w:rFonts w:ascii="Aptos" w:hAnsi="Aptos"/>
+          <w:sz w:val="22"/>
+          <w:szCs w:val="22"/>
+        </w:rPr>
       </w:pPr>
       <w:r>
+        <w:rPr>
+          <w:rFonts w:ascii="Aptos" w:hAnsi="Aptos"/>
+          <w:sz w:val="22"/>
+          <w:szCs w:val="22"/>
+        </w:rPr>
         <w:t>8</w:t>
       </w:r>
       <w:r>
+        <w:rPr>
+          <w:rFonts w:ascii="Aptos" w:hAnsi="Aptos"/>
+          <w:sz w:val="22"/>
+          <w:szCs w:val="22"/>
+        </w:rPr>
         <w:t>. Timeline</w:t>
       </w:r>
       <w:bookmarkEnd w:id="8"/>
     </w:p>
     <w:p>
+      <w:pPr>
+        <w:spacing w:line="360" w:lineRule="auto"/>
+        <w:rPr>
+          <w:rFonts w:ascii="Aptos" w:hAnsi="Aptos"/>
+        </w:rPr>
+      </w:pPr>
       <w:r>
+        <w:rPr>
+          <w:rFonts w:ascii="Aptos" w:hAnsi="Aptos"/>
+        </w:rPr>
         <w:t>Week 1–2: Planning and design</w:t>
       </w:r>
       <w:r>
+        <w:rPr>
+          <w:rFonts w:ascii="Aptos" w:hAnsi="Aptos"/>
+        </w:rPr>
         <w:br/>
         <w:t>Week 3–4: Development</w:t>
       </w:r>
       <w:r>
+        <w:rPr>
+          <w:rFonts w:ascii="Aptos" w:hAnsi="Aptos"/>
+        </w:rPr>
         <w:br/>
         <w:t>Week 5: Testing</w:t>
       </w:r>
       <w:r>
+        <w:rPr>
+          <w:rFonts w:ascii="Aptos" w:hAnsi="Aptos"/>
+        </w:rPr>
         <w:br/>
         <w:t>Week 6: Launch</w:t>
       </w:r>
@@ -1452,18 +1717,40 @@
     <w:p>
       <w:pPr>
         <w:pStyle w:val="Heading2"/>
+        <w:spacing w:line="360" w:lineRule="auto"/>
+        <w:rPr>
+          <w:rFonts w:ascii="Aptos" w:hAnsi="Aptos"/>
+          <w:sz w:val="22"/>
+          <w:szCs w:val="22"/>
+        </w:rPr>
       </w:pPr>
       <w:bookmarkStart w:id="9" w:name="_Toc227224115"/>
       <w:r>
+        <w:rPr>
+          <w:rFonts w:ascii="Aptos" w:hAnsi="Aptos"/>
+          <w:sz w:val="22"/>
+          <w:szCs w:val="22"/>
+        </w:rPr>
         <w:t>9</w:t>
       </w:r>
       <w:r>
+        <w:rPr>
+          <w:rFonts w:ascii="Aptos" w:hAnsi="Aptos"/>
+          <w:sz w:val="22"/>
+          <w:szCs w:val="22"/>
+        </w:rPr>
         <w:t>. Budget</w:t>
       </w:r>
       <w:bookmarkEnd w:id="9"/>
     </w:p>
     <w:p>
+      <w:pPr>
+        <w:spacing w:line="360" w:lineRule="auto"/>
+      </w:pPr>
       <w:r>
+        <w:rPr>
+          <w:rFonts w:ascii="Aptos" w:hAnsi="Aptos"/>
+        </w:rPr>
         <w:t>Development (R5,000), hosting (R1,200/year), and maintenance (R500/month) are all included in the estimated cost.</w:t>
       </w:r>
     </w:p>

</xml_diff>

<commit_message>
edited the word document and created a pdf version of the word document
</commit_message>
<xml_diff>
--- a/Documents/Website Proposal project.docx
+++ b/Documents/Website Proposal project.docx
@@ -153,16 +153,9 @@
       </w:r>
     </w:p>
     <w:p/>
+    <w:bookmarkStart w:id="0" w:name="_Toc227574465" w:displacedByCustomXml="next"/>
     <w:sdt>
       <w:sdtPr>
-        <w:rPr>
-          <w:rFonts w:asciiTheme="minorHAnsi" w:eastAsiaTheme="minorEastAsia" w:hAnsiTheme="minorHAnsi" w:cstheme="minorBidi"/>
-          <w:b w:val="0"/>
-          <w:bCs w:val="0"/>
-          <w:color w:val="auto"/>
-          <w:sz w:val="22"/>
-          <w:szCs w:val="22"/>
-        </w:rPr>
         <w:id w:val="-32890298"/>
         <w:docPartObj>
           <w:docPartGallery w:val="Table of Contents"/>
@@ -175,17 +168,11 @@
         </w:rPr>
       </w:sdtEndPr>
       <w:sdtContent>
-        <w:p>
-          <w:pPr>
-            <w:pStyle w:val="TOCHeading"/>
-          </w:pPr>
-        </w:p>
+        <w:bookmarkEnd w:id="0" w:displacedByCustomXml="prev"/>
+        <w:p/>
         <w:p>
           <w:pPr>
             <w:pStyle w:val="TOC1"/>
-            <w:tabs>
-              <w:tab w:val="right" w:leader="dot" w:pos="8630"/>
-            </w:tabs>
             <w:rPr>
               <w:noProof/>
               <w:kern w:val="2"/>
@@ -196,6 +183,7 @@
             </w:rPr>
           </w:pPr>
           <w:r>
+            <w:lastRenderedPageBreak/>
             <w:fldChar w:fldCharType="begin"/>
           </w:r>
           <w:r>
@@ -204,20 +192,14 @@
           <w:r>
             <w:fldChar w:fldCharType="separate"/>
           </w:r>
-          <w:hyperlink w:anchor="_Toc227224104" w:history="1">
+          <w:hyperlink w:anchor="_Toc227574464" w:history="1">
             <w:r>
               <w:rPr>
                 <w:rStyle w:val="Hyperlink"/>
+                <w:rFonts w:ascii="Aptos" w:hAnsi="Aptos"/>
                 <w:noProof/>
               </w:rPr>
-              <w:t>C</w:t>
-            </w:r>
-            <w:r>
-              <w:rPr>
-                <w:rStyle w:val="Hyperlink"/>
-                <w:noProof/>
-              </w:rPr>
-              <w:t>over Page</w:t>
+              <w:t>Cover Page</w:t>
             </w:r>
             <w:r>
               <w:rPr>
@@ -238,7 +220,7 @@
                 <w:noProof/>
                 <w:webHidden/>
               </w:rPr>
-              <w:instrText xml:space="preserve"> PAGEREF _Toc227224104 \h </w:instrText>
+              <w:instrText xml:space="preserve"> PAGEREF _Toc227574464 \h </w:instrText>
             </w:r>
             <w:r>
               <w:rPr>
@@ -272,9 +254,6 @@
         <w:p>
           <w:pPr>
             <w:pStyle w:val="TOC1"/>
-            <w:tabs>
-              <w:tab w:val="right" w:leader="dot" w:pos="8630"/>
-            </w:tabs>
             <w:rPr>
               <w:noProof/>
               <w:kern w:val="2"/>
@@ -284,48 +263,14 @@
               <w14:ligatures w14:val="standardContextual"/>
             </w:rPr>
           </w:pPr>
-          <w:hyperlink w:anchor="_Toc227224105" w:history="1">
+          <w:hyperlink w:anchor="_Toc227574465" w:history="1">
             <w:r>
               <w:rPr>
                 <w:rStyle w:val="Hyperlink"/>
+                <w:rFonts w:ascii="Aptos" w:hAnsi="Aptos"/>
                 <w:noProof/>
               </w:rPr>
-              <w:t>T</w:t>
-            </w:r>
-            <w:r>
-              <w:rPr>
-                <w:rStyle w:val="Hyperlink"/>
-                <w:noProof/>
-              </w:rPr>
-              <w:t>able</w:t>
-            </w:r>
-            <w:r>
-              <w:rPr>
-                <w:rStyle w:val="Hyperlink"/>
-                <w:noProof/>
-              </w:rPr>
-              <w:t xml:space="preserve"> </w:t>
-            </w:r>
-            <w:r>
-              <w:rPr>
-                <w:rStyle w:val="Hyperlink"/>
-                <w:noProof/>
-              </w:rPr>
-              <w:t>of</w:t>
-            </w:r>
-            <w:r>
-              <w:rPr>
-                <w:rStyle w:val="Hyperlink"/>
-                <w:noProof/>
-              </w:rPr>
-              <w:t xml:space="preserve"> C</w:t>
-            </w:r>
-            <w:r>
-              <w:rPr>
-                <w:rStyle w:val="Hyperlink"/>
-                <w:noProof/>
-              </w:rPr>
-              <w:t>ontents</w:t>
+              <w:t>Table of Contents</w:t>
             </w:r>
             <w:r>
               <w:rPr>
@@ -346,7 +291,7 @@
                 <w:noProof/>
                 <w:webHidden/>
               </w:rPr>
-              <w:instrText xml:space="preserve"> PAGEREF _Toc227224105 \h </w:instrText>
+              <w:instrText xml:space="preserve"> PAGEREF _Toc227574465 \h </w:instrText>
             </w:r>
             <w:r>
               <w:rPr>
@@ -380,9 +325,6 @@
         <w:p>
           <w:pPr>
             <w:pStyle w:val="TOC1"/>
-            <w:tabs>
-              <w:tab w:val="right" w:leader="dot" w:pos="8630"/>
-            </w:tabs>
             <w:rPr>
               <w:noProof/>
               <w:kern w:val="2"/>
@@ -392,10 +334,11 @@
               <w14:ligatures w14:val="standardContextual"/>
             </w:rPr>
           </w:pPr>
-          <w:hyperlink w:anchor="_Toc227224106" w:history="1">
+          <w:hyperlink w:anchor="_Toc227574466" w:history="1">
             <w:r>
               <w:rPr>
                 <w:rStyle w:val="Hyperlink"/>
+                <w:rFonts w:ascii="Aptos" w:hAnsi="Aptos"/>
                 <w:noProof/>
               </w:rPr>
               <w:t>Proposal 1: Urban Brew Coffee Website</w:t>
@@ -419,7 +362,7 @@
                 <w:noProof/>
                 <w:webHidden/>
               </w:rPr>
-              <w:instrText xml:space="preserve"> PAGEREF _Toc227224106 \h </w:instrText>
+              <w:instrText xml:space="preserve"> PAGEREF _Toc227574466 \h </w:instrText>
             </w:r>
             <w:r>
               <w:rPr>
@@ -465,10 +408,11 @@
               <w14:ligatures w14:val="standardContextual"/>
             </w:rPr>
           </w:pPr>
-          <w:hyperlink w:anchor="_Toc227224107" w:history="1">
+          <w:hyperlink w:anchor="_Toc227574467" w:history="1">
             <w:r>
               <w:rPr>
                 <w:rStyle w:val="Hyperlink"/>
+                <w:rFonts w:ascii="Aptos" w:hAnsi="Aptos"/>
                 <w:noProof/>
               </w:rPr>
               <w:t>1. Organization Overview</w:t>
@@ -492,7 +436,7 @@
                 <w:noProof/>
                 <w:webHidden/>
               </w:rPr>
-              <w:instrText xml:space="preserve"> PAGEREF _Toc227224107 \h </w:instrText>
+              <w:instrText xml:space="preserve"> PAGEREF _Toc227574467 \h </w:instrText>
             </w:r>
             <w:r>
               <w:rPr>
@@ -538,10 +482,11 @@
               <w14:ligatures w14:val="standardContextual"/>
             </w:rPr>
           </w:pPr>
-          <w:hyperlink w:anchor="_Toc227224108" w:history="1">
+          <w:hyperlink w:anchor="_Toc227574468" w:history="1">
             <w:r>
               <w:rPr>
                 <w:rStyle w:val="Hyperlink"/>
+                <w:rFonts w:ascii="Aptos" w:hAnsi="Aptos"/>
                 <w:noProof/>
               </w:rPr>
               <w:t>2. Website Goals and Objectives</w:t>
@@ -565,7 +510,7 @@
                 <w:noProof/>
                 <w:webHidden/>
               </w:rPr>
-              <w:instrText xml:space="preserve"> PAGEREF _Toc227224108 \h </w:instrText>
+              <w:instrText xml:space="preserve"> PAGEREF _Toc227574468 \h </w:instrText>
             </w:r>
             <w:r>
               <w:rPr>
@@ -611,10 +556,11 @@
               <w14:ligatures w14:val="standardContextual"/>
             </w:rPr>
           </w:pPr>
-          <w:hyperlink w:anchor="_Toc227224109" w:history="1">
+          <w:hyperlink w:anchor="_Toc227574469" w:history="1">
             <w:r>
               <w:rPr>
                 <w:rStyle w:val="Hyperlink"/>
+                <w:rFonts w:ascii="Aptos" w:hAnsi="Aptos"/>
                 <w:noProof/>
               </w:rPr>
               <w:t>3. Current Website Analysis</w:t>
@@ -638,7 +584,7 @@
                 <w:noProof/>
                 <w:webHidden/>
               </w:rPr>
-              <w:instrText xml:space="preserve"> PAGEREF _Toc227224109 \h </w:instrText>
+              <w:instrText xml:space="preserve"> PAGEREF _Toc227574469 \h </w:instrText>
             </w:r>
             <w:r>
               <w:rPr>
@@ -684,13 +630,14 @@
               <w14:ligatures w14:val="standardContextual"/>
             </w:rPr>
           </w:pPr>
-          <w:hyperlink w:anchor="_Toc227224110" w:history="1">
+          <w:hyperlink w:anchor="_Toc227574470" w:history="1">
             <w:r>
               <w:rPr>
                 <w:rStyle w:val="Hyperlink"/>
+                <w:rFonts w:ascii="Aptos" w:hAnsi="Aptos"/>
                 <w:noProof/>
               </w:rPr>
-              <w:t>4. Features and Functionality</w:t>
+              <w:t>4. Features and Functionality                                                                                                                              A homepage, menu page, contact page, about us page, gallery page, and online ordering system will all be part of the website. Promotions are extra features.</w:t>
             </w:r>
             <w:r>
               <w:rPr>
@@ -711,7 +658,78 @@
                 <w:noProof/>
                 <w:webHidden/>
               </w:rPr>
-              <w:instrText xml:space="preserve"> PAGEREF _Toc227224110 \h </w:instrText>
+              <w:instrText xml:space="preserve"> PAGEREF _Toc227574470 \h </w:instrText>
+            </w:r>
+            <w:r>
+              <w:rPr>
+                <w:noProof/>
+                <w:webHidden/>
+              </w:rPr>
+            </w:r>
+            <w:r>
+              <w:rPr>
+                <w:noProof/>
+                <w:webHidden/>
+              </w:rPr>
+              <w:fldChar w:fldCharType="separate"/>
+            </w:r>
+            <w:r>
+              <w:rPr>
+                <w:noProof/>
+                <w:webHidden/>
+              </w:rPr>
+              <w:t>3</w:t>
+            </w:r>
+            <w:r>
+              <w:rPr>
+                <w:noProof/>
+                <w:webHidden/>
+              </w:rPr>
+              <w:fldChar w:fldCharType="end"/>
+            </w:r>
+          </w:hyperlink>
+        </w:p>
+        <w:p>
+          <w:pPr>
+            <w:pStyle w:val="TOC1"/>
+            <w:rPr>
+              <w:noProof/>
+              <w:kern w:val="2"/>
+              <w:sz w:val="24"/>
+              <w:szCs w:val="24"/>
+              <w:lang w:val="en-ZA" w:eastAsia="en-ZA"/>
+              <w14:ligatures w14:val="standardContextual"/>
+            </w:rPr>
+          </w:pPr>
+          <w:hyperlink w:anchor="_Toc227574471" w:history="1">
+            <w:r>
+              <w:rPr>
+                <w:rStyle w:val="Hyperlink"/>
+                <w:rFonts w:ascii="Aptos" w:hAnsi="Aptos"/>
+                <w:noProof/>
+              </w:rPr>
+              <w:t>5. Design and UX                                                                                                                                                 Warm colors like cream and brown will be used in the design to represent the company identity. The design will be straightforward, tidy, and easy to use. The navigation will be responsive to mobile devices and easy to use.</w:t>
+            </w:r>
+            <w:r>
+              <w:rPr>
+                <w:noProof/>
+                <w:webHidden/>
+              </w:rPr>
+              <w:tab/>
+            </w:r>
+            <w:r>
+              <w:rPr>
+                <w:noProof/>
+                <w:webHidden/>
+              </w:rPr>
+              <w:fldChar w:fldCharType="begin"/>
+            </w:r>
+            <w:r>
+              <w:rPr>
+                <w:noProof/>
+                <w:webHidden/>
+              </w:rPr>
+              <w:instrText xml:space="preserve"> PAGEREF _Toc227574471 \h </w:instrText>
             </w:r>
             <w:r>
               <w:rPr>
@@ -757,83 +775,11 @@
               <w14:ligatures w14:val="standardContextual"/>
             </w:rPr>
           </w:pPr>
-          <w:hyperlink w:anchor="_Toc227224111" w:history="1">
+          <w:hyperlink w:anchor="_Toc227574472" w:history="1">
             <w:r>
               <w:rPr>
                 <w:rStyle w:val="Hyperlink"/>
-                <w:noProof/>
-              </w:rPr>
-              <w:t>5. Design and UX</w:t>
-            </w:r>
-            <w:r>
-              <w:rPr>
-                <w:noProof/>
-                <w:webHidden/>
-              </w:rPr>
-              <w:tab/>
-            </w:r>
-            <w:r>
-              <w:rPr>
-                <w:noProof/>
-                <w:webHidden/>
-              </w:rPr>
-              <w:fldChar w:fldCharType="begin"/>
-            </w:r>
-            <w:r>
-              <w:rPr>
-                <w:noProof/>
-                <w:webHidden/>
-              </w:rPr>
-              <w:instrText xml:space="preserve"> PAGEREF _Toc227224111 \h </w:instrText>
-            </w:r>
-            <w:r>
-              <w:rPr>
-                <w:noProof/>
-                <w:webHidden/>
-              </w:rPr>
-            </w:r>
-            <w:r>
-              <w:rPr>
-                <w:noProof/>
-                <w:webHidden/>
-              </w:rPr>
-              <w:fldChar w:fldCharType="separate"/>
-            </w:r>
-            <w:r>
-              <w:rPr>
-                <w:noProof/>
-                <w:webHidden/>
-              </w:rPr>
-              <w:t>3</w:t>
-            </w:r>
-            <w:r>
-              <w:rPr>
-                <w:noProof/>
-                <w:webHidden/>
-              </w:rPr>
-              <w:fldChar w:fldCharType="end"/>
-            </w:r>
-          </w:hyperlink>
-        </w:p>
-        <w:p>
-          <w:pPr>
-            <w:pStyle w:val="TOC2"/>
-            <w:tabs>
-              <w:tab w:val="right" w:leader="dot" w:pos="8630"/>
-            </w:tabs>
-            <w:rPr>
-              <w:noProof/>
-              <w:kern w:val="2"/>
-              <w:sz w:val="24"/>
-              <w:szCs w:val="24"/>
-              <w:lang w:val="en-ZA" w:eastAsia="en-ZA"/>
-              <w14:ligatures w14:val="standardContextual"/>
-            </w:rPr>
-          </w:pPr>
-          <w:hyperlink w:anchor="_Toc227224112" w:history="1">
-            <w:r>
-              <w:rPr>
-                <w:rStyle w:val="Hyperlink"/>
+                <w:rFonts w:ascii="Aptos" w:hAnsi="Aptos"/>
                 <w:noProof/>
               </w:rPr>
               <w:t>6. Wireframe</w:t>
@@ -857,7 +803,7 @@
                 <w:noProof/>
                 <w:webHidden/>
               </w:rPr>
-              <w:instrText xml:space="preserve"> PAGEREF _Toc227224112 \h </w:instrText>
+              <w:instrText xml:space="preserve"> PAGEREF _Toc227574472 \h </w:instrText>
             </w:r>
             <w:r>
               <w:rPr>
@@ -903,13 +849,14 @@
               <w14:ligatures w14:val="standardContextual"/>
             </w:rPr>
           </w:pPr>
-          <w:hyperlink w:anchor="_Toc227224113" w:history="1">
+          <w:hyperlink w:anchor="_Toc227574473" w:history="1">
             <w:r>
               <w:rPr>
                 <w:rStyle w:val="Hyperlink"/>
+                <w:rFonts w:ascii="Aptos" w:hAnsi="Aptos"/>
                 <w:noProof/>
               </w:rPr>
-              <w:t>7. Technical Requirements</w:t>
+              <w:t>7. Technical Requirements                                                                                                                                  HTML will be used in the construction of the website.</w:t>
             </w:r>
             <w:r>
               <w:rPr>
@@ -930,7 +877,7 @@
                 <w:noProof/>
                 <w:webHidden/>
               </w:rPr>
-              <w:instrText xml:space="preserve"> PAGEREF _Toc227224113 \h </w:instrText>
+              <w:instrText xml:space="preserve"> PAGEREF _Toc227574473 \h </w:instrText>
             </w:r>
             <w:r>
               <w:rPr>
@@ -976,10 +923,11 @@
               <w14:ligatures w14:val="standardContextual"/>
             </w:rPr>
           </w:pPr>
-          <w:hyperlink w:anchor="_Toc227224114" w:history="1">
+          <w:hyperlink w:anchor="_Toc227574474" w:history="1">
             <w:r>
               <w:rPr>
                 <w:rStyle w:val="Hyperlink"/>
+                <w:rFonts w:ascii="Aptos" w:hAnsi="Aptos"/>
                 <w:noProof/>
               </w:rPr>
               <w:t>8. Timeline</w:t>
@@ -1003,7 +951,7 @@
                 <w:noProof/>
                 <w:webHidden/>
               </w:rPr>
-              <w:instrText xml:space="preserve"> PAGEREF _Toc227224114 \h </w:instrText>
+              <w:instrText xml:space="preserve"> PAGEREF _Toc227574474 \h </w:instrText>
             </w:r>
             <w:r>
               <w:rPr>
@@ -1049,10 +997,11 @@
               <w14:ligatures w14:val="standardContextual"/>
             </w:rPr>
           </w:pPr>
-          <w:hyperlink w:anchor="_Toc227224115" w:history="1">
+          <w:hyperlink w:anchor="_Toc227574475" w:history="1">
             <w:r>
               <w:rPr>
                 <w:rStyle w:val="Hyperlink"/>
+                <w:rFonts w:ascii="Aptos" w:hAnsi="Aptos"/>
                 <w:noProof/>
               </w:rPr>
               <w:t>9. Budget</w:t>
@@ -1076,7 +1025,7 @@
                 <w:noProof/>
                 <w:webHidden/>
               </w:rPr>
-              <w:instrText xml:space="preserve"> PAGEREF _Toc227224115 \h </w:instrText>
+              <w:instrText xml:space="preserve"> PAGEREF _Toc227574475 \h </w:instrText>
             </w:r>
             <w:r>
               <w:rPr>
@@ -1108,6 +1057,78 @@
           </w:hyperlink>
         </w:p>
         <w:p>
+          <w:pPr>
+            <w:pStyle w:val="TOC1"/>
+            <w:rPr>
+              <w:noProof/>
+              <w:kern w:val="2"/>
+              <w:sz w:val="24"/>
+              <w:szCs w:val="24"/>
+              <w:lang w:val="en-ZA" w:eastAsia="en-ZA"/>
+              <w14:ligatures w14:val="standardContextual"/>
+            </w:rPr>
+          </w:pPr>
+          <w:hyperlink w:anchor="_Toc227574476" w:history="1">
+            <w:r>
+              <w:rPr>
+                <w:rStyle w:val="Hyperlink"/>
+                <w:rFonts w:ascii="Aptos" w:hAnsi="Aptos"/>
+                <w:noProof/>
+                <w:lang w:val="en-ZA"/>
+              </w:rPr>
+              <w:t>References</w:t>
+            </w:r>
+            <w:r>
+              <w:rPr>
+                <w:noProof/>
+                <w:webHidden/>
+              </w:rPr>
+              <w:tab/>
+            </w:r>
+            <w:r>
+              <w:rPr>
+                <w:noProof/>
+                <w:webHidden/>
+              </w:rPr>
+              <w:fldChar w:fldCharType="begin"/>
+            </w:r>
+            <w:r>
+              <w:rPr>
+                <w:noProof/>
+                <w:webHidden/>
+              </w:rPr>
+              <w:instrText xml:space="preserve"> PAGEREF _Toc227574476 \h </w:instrText>
+            </w:r>
+            <w:r>
+              <w:rPr>
+                <w:noProof/>
+                <w:webHidden/>
+              </w:rPr>
+            </w:r>
+            <w:r>
+              <w:rPr>
+                <w:noProof/>
+                <w:webHidden/>
+              </w:rPr>
+              <w:fldChar w:fldCharType="separate"/>
+            </w:r>
+            <w:r>
+              <w:rPr>
+                <w:noProof/>
+                <w:webHidden/>
+              </w:rPr>
+              <w:t>5</w:t>
+            </w:r>
+            <w:r>
+              <w:rPr>
+                <w:noProof/>
+                <w:webHidden/>
+              </w:rPr>
+              <w:fldChar w:fldCharType="end"/>
+            </w:r>
+          </w:hyperlink>
+        </w:p>
+        <w:p>
           <w:r>
             <w:rPr>
               <w:b/>
@@ -1123,37 +1144,41 @@
     <w:p>
       <w:pPr>
         <w:pStyle w:val="Heading1"/>
+        <w:rPr>
+          <w:rFonts w:ascii="Aptos" w:hAnsi="Aptos"/>
+          <w:sz w:val="22"/>
+          <w:szCs w:val="22"/>
+        </w:rPr>
       </w:pPr>
     </w:p>
     <w:p>
       <w:pPr>
         <w:pStyle w:val="Heading1"/>
+        <w:spacing w:line="360" w:lineRule="auto"/>
       </w:pPr>
     </w:p>
     <w:p>
       <w:pPr>
         <w:pStyle w:val="Heading1"/>
+        <w:spacing w:line="360" w:lineRule="auto"/>
       </w:pPr>
     </w:p>
     <w:p>
       <w:pPr>
-        <w:pStyle w:val="Heading1"/>
+        <w:spacing w:line="360" w:lineRule="auto"/>
+        <w:rPr>
+          <w:lang w:val="en-ZA"/>
+        </w:rPr>
       </w:pPr>
     </w:p>
     <w:p>
       <w:pPr>
-        <w:pStyle w:val="Heading1"/>
+        <w:spacing w:line="360" w:lineRule="auto"/>
+        <w:rPr>
+          <w:lang w:val="en-ZA"/>
+        </w:rPr>
       </w:pPr>
     </w:p>
-    <w:p>
-      <w:pPr>
-        <w:pStyle w:val="Heading1"/>
-      </w:pPr>
-    </w:p>
-    <w:p/>
-    <w:p/>
-    <w:p/>
-    <w:p/>
     <w:p>
       <w:pPr>
         <w:pStyle w:val="Heading1"/>
@@ -1164,7 +1189,7 @@
           <w:szCs w:val="22"/>
         </w:rPr>
       </w:pPr>
-      <w:bookmarkStart w:id="0" w:name="_Toc227224106"/>
+      <w:bookmarkStart w:id="1" w:name="_Toc227574466"/>
       <w:r>
         <w:rPr>
           <w:rFonts w:ascii="Aptos" w:hAnsi="Aptos"/>
@@ -1174,7 +1199,7 @@
         <w:lastRenderedPageBreak/>
         <w:t>Proposal 1: Urban Brew Coffee Website</w:t>
       </w:r>
-      <w:bookmarkEnd w:id="0"/>
+      <w:bookmarkEnd w:id="1"/>
     </w:p>
     <w:p>
       <w:pPr>
@@ -1186,7 +1211,7 @@
           <w:szCs w:val="22"/>
         </w:rPr>
       </w:pPr>
-      <w:bookmarkStart w:id="1" w:name="_Toc227224107"/>
+      <w:bookmarkStart w:id="2" w:name="_Toc227574467"/>
       <w:r>
         <w:rPr>
           <w:rFonts w:ascii="Aptos" w:hAnsi="Aptos"/>
@@ -1194,95 +1219,6 @@
           <w:szCs w:val="22"/>
         </w:rPr>
         <w:t>1. Organization Overview</w:t>
-      </w:r>
-      <w:bookmarkEnd w:id="1"/>
-    </w:p>
-    <w:p>
-      <w:pPr>
-        <w:spacing w:line="360" w:lineRule="auto"/>
-        <w:rPr>
-          <w:rFonts w:ascii="Aptos" w:hAnsi="Aptos"/>
-        </w:rPr>
-      </w:pPr>
-      <w:r>
-        <w:rPr>
-          <w:rFonts w:ascii="Aptos" w:hAnsi="Aptos"/>
-        </w:rPr>
-        <w:t>Founded in 201</w:t>
-      </w:r>
-      <w:r>
-        <w:rPr>
-          <w:rFonts w:ascii="Aptos" w:hAnsi="Aptos"/>
-        </w:rPr>
-        <w:t>9</w:t>
-      </w:r>
-      <w:r>
-        <w:rPr>
-          <w:rFonts w:ascii="Aptos" w:hAnsi="Aptos"/>
-        </w:rPr>
-        <w:t>, Urban Brew Coffee is a stand-alone coffee store. It focuses on providing high-quality coffee items while establishing a calm and friendly atmosphere for clients. Through social media marketing and word-of-mouth, the company has steadily expanded.</w:t>
-      </w:r>
-      <w:r>
-        <w:rPr>
-          <w:rFonts w:ascii="Aptos" w:hAnsi="Aptos"/>
-        </w:rPr>
-        <w:br/>
-      </w:r>
-      <w:r>
-        <w:rPr>
-          <w:rFonts w:ascii="Aptos" w:hAnsi="Aptos"/>
-        </w:rPr>
-        <w:br/>
-      </w:r>
-      <w:r>
-        <w:rPr>
-          <w:rFonts w:ascii="Aptos" w:hAnsi="Aptos"/>
-        </w:rPr>
-        <w:t xml:space="preserve">Our mission is to provide outstanding service and superior coffee.                                      </w:t>
-      </w:r>
-      <w:r>
-        <w:rPr>
-          <w:rFonts w:ascii="Aptos" w:hAnsi="Aptos"/>
-        </w:rPr>
-        <w:t xml:space="preserve">           </w:t>
-      </w:r>
-      <w:r>
-        <w:rPr>
-          <w:rFonts w:ascii="Aptos" w:hAnsi="Aptos"/>
-        </w:rPr>
-        <w:t xml:space="preserve"> Vision: To become the area's top coffee destination.                                                              </w:t>
-      </w:r>
-      <w:r>
-        <w:rPr>
-          <w:rFonts w:ascii="Aptos" w:hAnsi="Aptos"/>
-        </w:rPr>
-        <w:t xml:space="preserve">         </w:t>
-      </w:r>
-      <w:r>
-        <w:rPr>
-          <w:rFonts w:ascii="Aptos" w:hAnsi="Aptos"/>
-        </w:rPr>
-        <w:t>Students, young professionals, and remote workers between the ages of 18 and 40 are the target audience.</w:t>
-      </w:r>
-    </w:p>
-    <w:p>
-      <w:pPr>
-        <w:pStyle w:val="Heading2"/>
-        <w:spacing w:line="360" w:lineRule="auto"/>
-        <w:rPr>
-          <w:rFonts w:ascii="Aptos" w:hAnsi="Aptos"/>
-          <w:sz w:val="22"/>
-          <w:szCs w:val="22"/>
-        </w:rPr>
-      </w:pPr>
-      <w:bookmarkStart w:id="2" w:name="_Toc227224108"/>
-      <w:r>
-        <w:rPr>
-          <w:rFonts w:ascii="Aptos" w:hAnsi="Aptos"/>
-          <w:sz w:val="22"/>
-          <w:szCs w:val="22"/>
-        </w:rPr>
-        <w:t>2. Website Goals and Objectives</w:t>
       </w:r>
       <w:bookmarkEnd w:id="2"/>
     </w:p>
@@ -1297,7 +1233,7 @@
         <w:rPr>
           <w:rFonts w:ascii="Aptos" w:hAnsi="Aptos"/>
         </w:rPr>
-        <w:t>The website's objectives are to raise brand awareness, draw in new clients, and offer an online buying system. It will act as a focal point for promotions and information.</w:t>
+        <w:t>Founded in 2019, Urban Brew Coffee is a stand-alone coffee store. It focuses on providing high-quality coffee items while establishing a calm and friendly atmosphere for clients. Through social media marketing and word-of-mouth, the company has steadily expanded (Kotler et al., 2020).</w:t>
       </w:r>
       <w:r>
         <w:rPr>
@@ -1309,7 +1245,8 @@
         <w:rPr>
           <w:rFonts w:ascii="Aptos" w:hAnsi="Aptos"/>
         </w:rPr>
-        <w:t>Increased traffic, online sales, and customer interaction indicators are examples of KPIs.</w:t>
+        <w:br/>
+        <w:t>Our mission is to provide outstanding service and superior coffee.                                                  Vision: To become the area's top coffee destination.                                                                       Students, young professionals, and remote workers between the ages of 18 and 40 are the target audience.</w:t>
       </w:r>
     </w:p>
     <w:p>
@@ -1322,7 +1259,57 @@
           <w:szCs w:val="22"/>
         </w:rPr>
       </w:pPr>
-      <w:bookmarkStart w:id="3" w:name="_Toc227224109"/>
+      <w:bookmarkStart w:id="3" w:name="_Toc227574468"/>
+      <w:r>
+        <w:rPr>
+          <w:rFonts w:ascii="Aptos" w:hAnsi="Aptos"/>
+          <w:sz w:val="22"/>
+          <w:szCs w:val="22"/>
+        </w:rPr>
+        <w:t>2. Website Goals and Objectives</w:t>
+      </w:r>
+      <w:bookmarkEnd w:id="3"/>
+    </w:p>
+    <w:p>
+      <w:pPr>
+        <w:spacing w:line="360" w:lineRule="auto"/>
+        <w:rPr>
+          <w:rFonts w:ascii="Aptos" w:hAnsi="Aptos"/>
+          <w:lang w:val="en-ZA"/>
+        </w:rPr>
+      </w:pPr>
+      <w:r>
+        <w:rPr>
+          <w:rFonts w:ascii="Aptos" w:hAnsi="Aptos"/>
+        </w:rPr>
+        <w:t>The website's objectives are to raise brand awareness, draw in new clients, and offer an online buying system. It will act as a focal point for promotions and information.</w:t>
+      </w:r>
+      <w:r>
+        <w:rPr>
+          <w:rFonts w:ascii="Aptos" w:hAnsi="Aptos"/>
+        </w:rPr>
+        <w:br/>
+        <w:t xml:space="preserve">Increased traffic, online sales, and customer interaction indicators are examples of KPIs </w:t>
+      </w:r>
+      <w:r>
+        <w:rPr>
+          <w:rFonts w:ascii="Aptos" w:hAnsi="Aptos"/>
+          <w:lang w:val="en-ZA"/>
+        </w:rPr>
+        <w:t>(Ryan, 2021).</w:t>
+      </w:r>
+    </w:p>
+    <w:p>
+      <w:pPr>
+        <w:pStyle w:val="Heading2"/>
+        <w:spacing w:line="360" w:lineRule="auto"/>
+        <w:rPr>
+          <w:rFonts w:ascii="Aptos" w:hAnsi="Aptos"/>
+          <w:sz w:val="22"/>
+          <w:szCs w:val="22"/>
+        </w:rPr>
+      </w:pPr>
+      <w:bookmarkStart w:id="4" w:name="_Toc227574469"/>
       <w:r>
         <w:rPr>
           <w:rFonts w:ascii="Aptos" w:hAnsi="Aptos"/>
@@ -1331,7 +1318,7 @@
         </w:rPr>
         <w:t>3. Current Website Analysis</w:t>
       </w:r>
-      <w:bookmarkEnd w:id="3"/>
+      <w:bookmarkEnd w:id="4"/>
     </w:p>
     <w:p>
       <w:pPr>
@@ -1344,19 +1331,14 @@
         <w:rPr>
           <w:rFonts w:ascii="Aptos" w:hAnsi="Aptos"/>
         </w:rPr>
-        <w:t>The company now uses social media and doesn't have a proper website. This restricts professionalism and accessibility.</w:t>
+        <w:t>The company now uses social media and doesn't have a proper website. This restricts professionalism and accessibility</w:t>
       </w:r>
       <w:r>
         <w:rPr>
           <w:rFonts w:ascii="Aptos" w:hAnsi="Aptos"/>
         </w:rPr>
         <w:br/>
-      </w:r>
-      <w:r>
-        <w:rPr>
-          <w:rFonts w:ascii="Aptos" w:hAnsi="Aptos"/>
-        </w:rPr>
-        <w:t>Creating a responsive website with ordering features is one improvement.</w:t>
+        <w:t xml:space="preserve">Creating a responsive website with ordering features is one improvement </w:t>
       </w:r>
     </w:p>
     <w:p>
@@ -1369,40 +1351,14 @@
           <w:szCs w:val="22"/>
         </w:rPr>
       </w:pPr>
-      <w:bookmarkStart w:id="4" w:name="_Toc227224110"/>
+      <w:bookmarkStart w:id="5" w:name="_Toc227574470"/>
       <w:r>
         <w:rPr>
           <w:rFonts w:ascii="Aptos" w:hAnsi="Aptos"/>
           <w:sz w:val="22"/>
           <w:szCs w:val="22"/>
         </w:rPr>
-        <w:t>4. Features and Functionality</w:t>
-      </w:r>
-      <w:bookmarkStart w:id="5" w:name="_Toc227224111"/>
-      <w:bookmarkEnd w:id="4"/>
-      <w:r>
-        <w:rPr>
-          <w:rFonts w:ascii="Aptos" w:hAnsi="Aptos"/>
-          <w:sz w:val="22"/>
-          <w:szCs w:val="22"/>
-        </w:rPr>
-        <w:t xml:space="preserve">                                                                                           </w:t>
-      </w:r>
-      <w:r>
-        <w:rPr>
-          <w:rFonts w:ascii="Aptos" w:hAnsi="Aptos"/>
-          <w:sz w:val="22"/>
-          <w:szCs w:val="22"/>
-        </w:rPr>
-        <w:t xml:space="preserve">                                  </w:t>
-      </w:r>
-      <w:r>
-        <w:rPr>
-          <w:rFonts w:ascii="Aptos" w:hAnsi="Aptos"/>
-          <w:sz w:val="22"/>
-          <w:szCs w:val="22"/>
-        </w:rPr>
-        <w:t xml:space="preserve"> </w:t>
+        <w:t xml:space="preserve">4. Features and Functionality                                                                                                                              </w:t>
       </w:r>
       <w:r>
         <w:rPr>
@@ -1413,30 +1369,9 @@
           <w:sz w:val="22"/>
           <w:szCs w:val="22"/>
         </w:rPr>
-        <w:t xml:space="preserve">A homepage, menu page, contact page, about us page, gallery page, and online ordering system will all be part of the website. </w:t>
+        <w:t>A homepage, menu page, contact page, about us page, gallery page, and online ordering system will all be part of the website. Promotions are extra features.</w:t>
       </w:r>
-      <w:r>
-        <w:rPr>
-          <w:rFonts w:ascii="Aptos" w:eastAsiaTheme="minorEastAsia" w:hAnsi="Aptos" w:cstheme="minorBidi"/>
-          <w:b w:val="0"/>
-          <w:bCs w:val="0"/>
-          <w:color w:val="auto"/>
-          <w:sz w:val="22"/>
-          <w:szCs w:val="22"/>
-        </w:rPr>
-        <w:t>P</w:t>
-      </w:r>
-      <w:r>
-        <w:rPr>
-          <w:rFonts w:ascii="Aptos" w:eastAsiaTheme="minorEastAsia" w:hAnsi="Aptos" w:cstheme="minorBidi"/>
-          <w:b w:val="0"/>
-          <w:bCs w:val="0"/>
-          <w:color w:val="auto"/>
-          <w:sz w:val="22"/>
-          <w:szCs w:val="22"/>
-        </w:rPr>
-        <w:t>romotions are extra features.</w:t>
-      </w:r>
+      <w:bookmarkEnd w:id="5"/>
     </w:p>
     <w:p>
       <w:pPr>
@@ -1448,30 +1383,14 @@
           <w:szCs w:val="22"/>
         </w:rPr>
       </w:pPr>
+      <w:bookmarkStart w:id="6" w:name="_Toc227574471"/>
       <w:r>
         <w:rPr>
           <w:rFonts w:ascii="Aptos" w:hAnsi="Aptos"/>
           <w:sz w:val="22"/>
           <w:szCs w:val="22"/>
         </w:rPr>
-        <w:t>5. Design and UX</w:t>
-      </w:r>
-      <w:bookmarkEnd w:id="5"/>
-      <w:r>
-        <w:rPr>
-          <w:rFonts w:ascii="Aptos" w:hAnsi="Aptos"/>
-          <w:sz w:val="22"/>
-          <w:szCs w:val="22"/>
-        </w:rPr>
-        <w:t xml:space="preserve">                                                                                                  </w:t>
-      </w:r>
-      <w:r>
-        <w:rPr>
-          <w:rFonts w:ascii="Aptos" w:hAnsi="Aptos"/>
-          <w:sz w:val="22"/>
-          <w:szCs w:val="22"/>
-        </w:rPr>
-        <w:t xml:space="preserve">                                               </w:t>
+        <w:t xml:space="preserve">5. Design and UX                                                                                                                                                 </w:t>
       </w:r>
       <w:r>
         <w:rPr>
@@ -1484,6 +1403,7 @@
         </w:rPr>
         <w:t>Warm colors like cream and brown will be used in the design to represent the company identity. The design will be straightforward, tidy, and easy to use. The navigation will be responsive to mobile devices and easy to use.</w:t>
       </w:r>
+      <w:bookmarkEnd w:id="6"/>
     </w:p>
     <w:p>
       <w:pPr>
@@ -1503,7 +1423,7 @@
           <w:szCs w:val="22"/>
         </w:rPr>
       </w:pPr>
-      <w:bookmarkStart w:id="6" w:name="_Toc227224112"/>
+      <w:bookmarkStart w:id="7" w:name="_Toc227574472"/>
       <w:r>
         <w:rPr>
           <w:rFonts w:ascii="Aptos" w:hAnsi="Aptos"/>
@@ -1511,17 +1431,9 @@
           <w:szCs w:val="22"/>
         </w:rPr>
         <w:lastRenderedPageBreak/>
-        <w:t xml:space="preserve">6. </w:t>
+        <w:t>6. Wireframe</w:t>
       </w:r>
-      <w:r>
-        <w:rPr>
-          <w:rFonts w:ascii="Aptos" w:hAnsi="Aptos"/>
-          <w:sz w:val="22"/>
-          <w:szCs w:val="22"/>
-        </w:rPr>
-        <w:t>Wireframe</w:t>
-      </w:r>
-      <w:bookmarkEnd w:id="6"/>
+      <w:bookmarkEnd w:id="7"/>
     </w:p>
     <w:p>
       <w:pPr>
@@ -1536,7 +1448,7 @@
           <w:noProof/>
         </w:rPr>
         <w:drawing>
-          <wp:inline distT="0" distB="0" distL="0" distR="0" wp14:anchorId="0E9061FA" wp14:editId="540B7AB4">
+          <wp:inline distT="0" distB="0" distL="0" distR="0" wp14:anchorId="121EBFD7" wp14:editId="40B24CC9">
             <wp:extent cx="4572000" cy="4442460"/>
             <wp:effectExtent l="0" t="0" r="0" b="0"/>
             <wp:docPr id="1" name="Picture 1"/>
@@ -1582,40 +1494,14 @@
           <w:szCs w:val="22"/>
         </w:rPr>
       </w:pPr>
-      <w:bookmarkStart w:id="7" w:name="_Toc227224113"/>
+      <w:bookmarkStart w:id="8" w:name="_Toc227574473"/>
       <w:r>
         <w:rPr>
           <w:rFonts w:ascii="Aptos" w:hAnsi="Aptos"/>
           <w:sz w:val="22"/>
           <w:szCs w:val="22"/>
         </w:rPr>
-        <w:t>7</w:t>
-      </w:r>
-      <w:r>
-        <w:rPr>
-          <w:rFonts w:ascii="Aptos" w:hAnsi="Aptos"/>
-          <w:sz w:val="22"/>
-          <w:szCs w:val="22"/>
-        </w:rPr>
-        <w:t>. Technical Requirements</w:t>
-      </w:r>
-      <w:bookmarkStart w:id="8" w:name="_Toc227224114"/>
-      <w:bookmarkEnd w:id="7"/>
-      <w:r>
-        <w:rPr>
-          <w:rFonts w:ascii="Aptos" w:hAnsi="Aptos"/>
-          <w:sz w:val="22"/>
-          <w:szCs w:val="22"/>
-        </w:rPr>
-        <w:t xml:space="preserve">                                                                                           </w:t>
-      </w:r>
-      <w:r>
-        <w:rPr>
-          <w:rFonts w:ascii="Aptos" w:hAnsi="Aptos"/>
-          <w:sz w:val="22"/>
-          <w:szCs w:val="22"/>
-        </w:rPr>
-        <w:t xml:space="preserve">                                       </w:t>
+        <w:t xml:space="preserve">7. Technical Requirements                                                                                                                                  </w:t>
       </w:r>
       <w:r>
         <w:rPr>
@@ -1626,30 +1512,9 @@
           <w:sz w:val="22"/>
           <w:szCs w:val="22"/>
         </w:rPr>
-        <w:t>HTML</w:t>
+        <w:t>HTML will be used in the construction of the website.</w:t>
       </w:r>
-      <w:r>
-        <w:rPr>
-          <w:rFonts w:ascii="Aptos" w:eastAsiaTheme="minorEastAsia" w:hAnsi="Aptos" w:cstheme="minorBidi"/>
-          <w:b w:val="0"/>
-          <w:bCs w:val="0"/>
-          <w:color w:val="auto"/>
-          <w:sz w:val="22"/>
-          <w:szCs w:val="22"/>
-        </w:rPr>
-        <w:t xml:space="preserve"> </w:t>
-      </w:r>
-      <w:r>
-        <w:rPr>
-          <w:rFonts w:ascii="Aptos" w:eastAsiaTheme="minorEastAsia" w:hAnsi="Aptos" w:cstheme="minorBidi"/>
-          <w:b w:val="0"/>
-          <w:bCs w:val="0"/>
-          <w:color w:val="auto"/>
-          <w:sz w:val="22"/>
-          <w:szCs w:val="22"/>
-        </w:rPr>
-        <w:t>will be used in the construction of the website.</w:t>
-      </w:r>
+      <w:bookmarkEnd w:id="8"/>
     </w:p>
     <w:p>
       <w:pPr>
@@ -1661,23 +1526,16 @@
           <w:szCs w:val="22"/>
         </w:rPr>
       </w:pPr>
+      <w:bookmarkStart w:id="9" w:name="_Toc227574474"/>
       <w:r>
         <w:rPr>
           <w:rFonts w:ascii="Aptos" w:hAnsi="Aptos"/>
           <w:sz w:val="22"/>
           <w:szCs w:val="22"/>
         </w:rPr>
-        <w:t>8</w:t>
+        <w:t>8. Timeline</w:t>
       </w:r>
-      <w:r>
-        <w:rPr>
-          <w:rFonts w:ascii="Aptos" w:hAnsi="Aptos"/>
-          <w:sz w:val="22"/>
-          <w:szCs w:val="22"/>
-        </w:rPr>
-        <w:t>. Timeline</w:t>
-      </w:r>
-      <w:bookmarkEnd w:id="8"/>
+      <w:bookmarkEnd w:id="9"/>
     </w:p>
     <w:p>
       <w:pPr>
@@ -1724,34 +1582,301 @@
           <w:szCs w:val="22"/>
         </w:rPr>
       </w:pPr>
-      <w:bookmarkStart w:id="9" w:name="_Toc227224115"/>
+      <w:bookmarkStart w:id="10" w:name="_Toc227574475"/>
       <w:r>
         <w:rPr>
           <w:rFonts w:ascii="Aptos" w:hAnsi="Aptos"/>
           <w:sz w:val="22"/>
           <w:szCs w:val="22"/>
         </w:rPr>
-        <w:t>9</w:t>
+        <w:t>9. Budget</w:t>
       </w:r>
-      <w:r>
-        <w:rPr>
-          <w:rFonts w:ascii="Aptos" w:hAnsi="Aptos"/>
-          <w:sz w:val="22"/>
-          <w:szCs w:val="22"/>
-        </w:rPr>
-        <w:t>. Budget</w:t>
-      </w:r>
-      <w:bookmarkEnd w:id="9"/>
+      <w:bookmarkEnd w:id="10"/>
     </w:p>
     <w:p>
       <w:pPr>
         <w:spacing w:line="360" w:lineRule="auto"/>
+        <w:rPr>
+          <w:rFonts w:ascii="Aptos" w:hAnsi="Aptos"/>
+        </w:rPr>
       </w:pPr>
       <w:r>
         <w:rPr>
           <w:rFonts w:ascii="Aptos" w:hAnsi="Aptos"/>
         </w:rPr>
         <w:t>Development (R5,000), hosting (R1,200/year), and maintenance (R500/month) are all included in the estimated cost.</w:t>
+      </w:r>
+    </w:p>
+    <w:p>
+      <w:pPr>
+        <w:spacing w:line="360" w:lineRule="auto"/>
+        <w:rPr>
+          <w:rFonts w:ascii="Aptos" w:hAnsi="Aptos"/>
+        </w:rPr>
+      </w:pPr>
+    </w:p>
+    <w:p>
+      <w:pPr>
+        <w:spacing w:line="360" w:lineRule="auto"/>
+        <w:rPr>
+          <w:rFonts w:ascii="Aptos" w:hAnsi="Aptos"/>
+          <w:lang w:val="en-ZA"/>
+        </w:rPr>
+      </w:pPr>
+      <w:r>
+        <w:rPr>
+          <w:rFonts w:ascii="Aptos" w:hAnsi="Aptos"/>
+          <w:lang w:val="en-ZA"/>
+        </w:rPr>
+        <w:lastRenderedPageBreak/>
+        <w:t>Kotler, P. et al.</w:t>
+      </w:r>
+      <w:r>
+        <w:rPr>
+          <w:rFonts w:ascii="Aptos" w:hAnsi="Aptos"/>
+          <w:lang w:val="en-ZA"/>
+        </w:rPr>
+        <w:t>,</w:t>
+      </w:r>
+      <w:r>
+        <w:rPr>
+          <w:rFonts w:ascii="Aptos" w:hAnsi="Aptos"/>
+          <w:lang w:val="en-ZA"/>
+        </w:rPr>
+        <w:t xml:space="preserve"> 2020</w:t>
+      </w:r>
+      <w:r>
+        <w:rPr>
+          <w:rFonts w:ascii="Aptos" w:hAnsi="Aptos"/>
+          <w:lang w:val="en-ZA"/>
+        </w:rPr>
+        <w:t>.</w:t>
+      </w:r>
+      <w:r>
+        <w:rPr>
+          <w:rFonts w:ascii="Aptos" w:hAnsi="Aptos"/>
+          <w:lang w:val="en-ZA"/>
+        </w:rPr>
+        <w:t xml:space="preserve"> </w:t>
+      </w:r>
+      <w:r>
+        <w:rPr>
+          <w:rFonts w:ascii="Aptos" w:hAnsi="Aptos"/>
+          <w:i/>
+          <w:iCs/>
+          <w:lang w:val="en-ZA"/>
+        </w:rPr>
+        <w:t>Marketing Principles</w:t>
+      </w:r>
+      <w:r>
+        <w:rPr>
+          <w:rFonts w:ascii="Aptos" w:hAnsi="Aptos"/>
+          <w:lang w:val="en-ZA"/>
+        </w:rPr>
+        <w:t xml:space="preserve">. </w:t>
+      </w:r>
+      <w:r>
+        <w:rPr>
+          <w:rFonts w:ascii="Aptos" w:hAnsi="Aptos"/>
+          <w:lang w:val="en-ZA"/>
+        </w:rPr>
+        <w:t xml:space="preserve">[online] </w:t>
+      </w:r>
+      <w:r>
+        <w:rPr>
+          <w:rFonts w:ascii="Aptos" w:hAnsi="Aptos"/>
+          <w:lang w:val="en-ZA"/>
+        </w:rPr>
+        <w:t xml:space="preserve">Available at: </w:t>
+      </w:r>
+      <w:r>
+        <w:rPr>
+          <w:rFonts w:ascii="Aptos" w:hAnsi="Aptos"/>
+          <w:lang w:val="en-ZA"/>
+        </w:rPr>
+        <w:t xml:space="preserve"> &lt;</w:t>
+      </w:r>
+      <w:hyperlink r:id="rId7" w:history="1">
+        <w:r>
+          <w:rPr>
+            <w:rStyle w:val="Hyperlink"/>
+            <w:rFonts w:ascii="Aptos" w:hAnsi="Aptos"/>
+            <w:lang w:val="en-ZA"/>
+          </w:rPr>
+          <w:t>https://www.marketingjournal.org</w:t>
+        </w:r>
+      </w:hyperlink>
+      <w:r>
+        <w:rPr>
+          <w:rFonts w:ascii="Aptos" w:hAnsi="Aptos"/>
+        </w:rPr>
+        <w:t>&gt;</w:t>
+      </w:r>
+      <w:r>
+        <w:rPr>
+          <w:rFonts w:ascii="Aptos" w:hAnsi="Aptos"/>
+          <w:lang w:val="en-ZA"/>
+        </w:rPr>
+        <w:t xml:space="preserve"> </w:t>
+      </w:r>
+      <w:r>
+        <w:rPr>
+          <w:rFonts w:ascii="Aptos" w:hAnsi="Aptos"/>
+          <w:lang w:val="en-ZA"/>
+        </w:rPr>
+        <w:t>[</w:t>
+      </w:r>
+      <w:r>
+        <w:rPr>
+          <w:rFonts w:ascii="Aptos" w:hAnsi="Aptos"/>
+          <w:lang w:val="en-ZA"/>
+        </w:rPr>
+        <w:t>Accessed 20 April 2026</w:t>
+      </w:r>
+      <w:r>
+        <w:rPr>
+          <w:rFonts w:ascii="Aptos" w:hAnsi="Aptos"/>
+          <w:lang w:val="en-ZA"/>
+        </w:rPr>
+        <w:t>]</w:t>
+      </w:r>
+      <w:r>
+        <w:rPr>
+          <w:rFonts w:ascii="Aptos" w:hAnsi="Aptos"/>
+          <w:lang w:val="en-ZA"/>
+        </w:rPr>
+        <w:t>.</w:t>
+      </w:r>
+    </w:p>
+    <w:p>
+      <w:pPr>
+        <w:spacing w:line="360" w:lineRule="auto"/>
+        <w:rPr>
+          <w:lang w:val="en-ZA"/>
+        </w:rPr>
+      </w:pPr>
+      <w:r>
+        <w:rPr>
+          <w:rFonts w:ascii="Aptos" w:hAnsi="Aptos"/>
+          <w:lang w:val="en-ZA"/>
+        </w:rPr>
+        <w:t>Ryan, D.</w:t>
+      </w:r>
+      <w:r>
+        <w:rPr>
+          <w:rFonts w:ascii="Aptos" w:hAnsi="Aptos"/>
+          <w:lang w:val="en-ZA"/>
+        </w:rPr>
+        <w:t>,</w:t>
+      </w:r>
+      <w:r>
+        <w:rPr>
+          <w:rFonts w:ascii="Aptos" w:hAnsi="Aptos"/>
+          <w:lang w:val="en-ZA"/>
+        </w:rPr>
+        <w:t xml:space="preserve"> 2021</w:t>
+      </w:r>
+      <w:r>
+        <w:rPr>
+          <w:rFonts w:ascii="Aptos" w:hAnsi="Aptos"/>
+          <w:lang w:val="en-ZA"/>
+        </w:rPr>
+        <w:t>.</w:t>
+      </w:r>
+      <w:r>
+        <w:rPr>
+          <w:rFonts w:ascii="Aptos" w:hAnsi="Aptos"/>
+          <w:lang w:val="en-ZA"/>
+        </w:rPr>
+        <w:t xml:space="preserve"> </w:t>
+      </w:r>
+      <w:r>
+        <w:rPr>
+          <w:rFonts w:ascii="Aptos" w:hAnsi="Aptos"/>
+          <w:i/>
+          <w:iCs/>
+          <w:lang w:val="en-ZA"/>
+        </w:rPr>
+        <w:t>Understanding Digital Marketing</w:t>
+      </w:r>
+      <w:r>
+        <w:rPr>
+          <w:rFonts w:ascii="Aptos" w:hAnsi="Aptos"/>
+          <w:lang w:val="en-ZA"/>
+        </w:rPr>
+        <w:t xml:space="preserve">. </w:t>
+      </w:r>
+      <w:r>
+        <w:rPr>
+          <w:rFonts w:ascii="Aptos" w:hAnsi="Aptos"/>
+          <w:lang w:val="en-ZA"/>
+        </w:rPr>
+        <w:t xml:space="preserve">[online] </w:t>
+      </w:r>
+      <w:r>
+        <w:rPr>
+          <w:rFonts w:ascii="Aptos" w:hAnsi="Aptos"/>
+          <w:lang w:val="en-ZA"/>
+        </w:rPr>
+        <w:t xml:space="preserve">Available at: </w:t>
+      </w:r>
+      <w:r>
+        <w:rPr>
+          <w:rFonts w:ascii="Aptos" w:hAnsi="Aptos"/>
+          <w:lang w:val="en-ZA"/>
+        </w:rPr>
+        <w:t>&lt;</w:t>
+      </w:r>
+      <w:hyperlink r:id="rId8" w:history="1">
+        <w:r>
+          <w:rPr>
+            <w:rStyle w:val="Hyperlink"/>
+            <w:rFonts w:ascii="Aptos" w:hAnsi="Aptos"/>
+            <w:lang w:val="en-ZA"/>
+          </w:rPr>
+          <w:t>https://www.davechaffey.com</w:t>
+        </w:r>
+      </w:hyperlink>
+      <w:r>
+        <w:rPr>
+          <w:rFonts w:ascii="Aptos" w:hAnsi="Aptos"/>
+        </w:rPr>
+        <w:t>&gt;</w:t>
+      </w:r>
+      <w:r>
+        <w:rPr>
+          <w:rFonts w:ascii="Aptos" w:hAnsi="Aptos"/>
+          <w:lang w:val="en-ZA"/>
+        </w:rPr>
+        <w:t xml:space="preserve"> </w:t>
+      </w:r>
+      <w:r>
+        <w:rPr>
+          <w:rFonts w:ascii="Aptos" w:hAnsi="Aptos"/>
+          <w:lang w:val="en-ZA"/>
+        </w:rPr>
+        <w:t>[</w:t>
+      </w:r>
+      <w:r>
+        <w:rPr>
+          <w:rFonts w:ascii="Aptos" w:hAnsi="Aptos"/>
+          <w:lang w:val="en-ZA"/>
+        </w:rPr>
+        <w:t>Accessed 20 April 2026</w:t>
+      </w:r>
+      <w:r>
+        <w:rPr>
+          <w:rFonts w:ascii="Aptos" w:hAnsi="Aptos"/>
+          <w:lang w:val="en-ZA"/>
+        </w:rPr>
+        <w:t>]</w:t>
+      </w:r>
+      <w:r>
+        <w:rPr>
+          <w:rFonts w:ascii="Aptos" w:hAnsi="Aptos"/>
+          <w:lang w:val="en-ZA"/>
+        </w:rPr>
+        <w:t>.</w:t>
       </w:r>
     </w:p>
     <w:sectPr>
@@ -2570,7 +2695,6 @@
   <w:style w:type="character" w:default="1" w:styleId="DefaultParagraphFont">
     <w:name w:val="Default Paragraph Font"/>
     <w:uiPriority w:val="1"/>
-    <w:semiHidden/>
     <w:unhideWhenUsed/>
   </w:style>
   <w:style w:type="table" w:default="1" w:styleId="TableNormal">
@@ -13353,9 +13477,12 @@
     <w:autoRedefine/>
     <w:uiPriority w:val="39"/>
     <w:unhideWhenUsed/>
-    <w:rsid w:val="000B23D1"/>
+    <w:rsid w:val="00C50D99"/>
     <w:pPr>
-      <w:spacing w:after="100"/>
+      <w:tabs>
+        <w:tab w:val="right" w:leader="dot" w:pos="8630"/>
+      </w:tabs>
+      <w:spacing w:after="100" w:line="360" w:lineRule="auto"/>
     </w:pPr>
   </w:style>
   <w:style w:type="paragraph" w:styleId="TOC2">
@@ -13380,6 +13507,31 @@
     <w:rPr>
       <w:color w:val="0000FF" w:themeColor="hyperlink"/>
       <w:u w:val="single"/>
+    </w:rPr>
+  </w:style>
+  <w:style w:type="character" w:styleId="UnresolvedMention">
+    <w:name w:val="Unresolved Mention"/>
+    <w:basedOn w:val="DefaultParagraphFont"/>
+    <w:uiPriority w:val="99"/>
+    <w:semiHidden/>
+    <w:unhideWhenUsed/>
+    <w:rsid w:val="00B1087E"/>
+    <w:rPr>
+      <w:color w:val="605E5C"/>
+      <w:shd w:val="clear" w:color="auto" w:fill="E1DFDD"/>
+    </w:rPr>
+  </w:style>
+  <w:style w:type="paragraph" w:styleId="NormalWeb">
+    <w:name w:val="Normal (Web)"/>
+    <w:basedOn w:val="Normal"/>
+    <w:uiPriority w:val="99"/>
+    <w:semiHidden/>
+    <w:unhideWhenUsed/>
+    <w:rsid w:val="00B1087E"/>
+    <w:rPr>
+      <w:rFonts w:ascii="Times New Roman" w:hAnsi="Times New Roman" w:cs="Times New Roman"/>
+      <w:sz w:val="24"/>
+      <w:szCs w:val="24"/>
     </w:rPr>
   </w:style>
 </w:styles>

</xml_diff>

<commit_message>
made changes to my website propsal documents
</commit_message>
<xml_diff>
--- a/Documents/Website Proposal project.docx
+++ b/Documents/Website Proposal project.docx
@@ -153,7 +153,6 @@
       </w:r>
     </w:p>
     <w:p/>
-    <w:bookmarkStart w:id="0" w:name="_Toc227574465" w:displacedByCustomXml="next"/>
     <w:sdt>
       <w:sdtPr>
         <w:id w:val="-32890298"/>
@@ -168,7 +167,6 @@
         </w:rPr>
       </w:sdtEndPr>
       <w:sdtContent>
-        <w:bookmarkEnd w:id="0" w:displacedByCustomXml="prev"/>
         <w:p/>
         <w:p>
           <w:pPr>
@@ -192,149 +190,7 @@
           <w:r>
             <w:fldChar w:fldCharType="separate"/>
           </w:r>
-          <w:hyperlink w:anchor="_Toc227574464" w:history="1">
-            <w:r>
-              <w:rPr>
-                <w:rStyle w:val="Hyperlink"/>
-                <w:rFonts w:ascii="Aptos" w:hAnsi="Aptos"/>
-                <w:noProof/>
-              </w:rPr>
-              <w:t>Cover Page</w:t>
-            </w:r>
-            <w:r>
-              <w:rPr>
-                <w:noProof/>
-                <w:webHidden/>
-              </w:rPr>
-              <w:tab/>
-            </w:r>
-            <w:r>
-              <w:rPr>
-                <w:noProof/>
-                <w:webHidden/>
-              </w:rPr>
-              <w:fldChar w:fldCharType="begin"/>
-            </w:r>
-            <w:r>
-              <w:rPr>
-                <w:noProof/>
-                <w:webHidden/>
-              </w:rPr>
-              <w:instrText xml:space="preserve"> PAGEREF _Toc227574464 \h </w:instrText>
-            </w:r>
-            <w:r>
-              <w:rPr>
-                <w:noProof/>
-                <w:webHidden/>
-              </w:rPr>
-            </w:r>
-            <w:r>
-              <w:rPr>
-                <w:noProof/>
-                <w:webHidden/>
-              </w:rPr>
-              <w:fldChar w:fldCharType="separate"/>
-            </w:r>
-            <w:r>
-              <w:rPr>
-                <w:noProof/>
-                <w:webHidden/>
-              </w:rPr>
-              <w:t>1</w:t>
-            </w:r>
-            <w:r>
-              <w:rPr>
-                <w:noProof/>
-                <w:webHidden/>
-              </w:rPr>
-              <w:fldChar w:fldCharType="end"/>
-            </w:r>
-          </w:hyperlink>
-        </w:p>
-        <w:p>
-          <w:pPr>
-            <w:pStyle w:val="TOC1"/>
-            <w:rPr>
-              <w:noProof/>
-              <w:kern w:val="2"/>
-              <w:sz w:val="24"/>
-              <w:szCs w:val="24"/>
-              <w:lang w:val="en-ZA" w:eastAsia="en-ZA"/>
-              <w14:ligatures w14:val="standardContextual"/>
-            </w:rPr>
-          </w:pPr>
-          <w:hyperlink w:anchor="_Toc227574465" w:history="1">
-            <w:r>
-              <w:rPr>
-                <w:rStyle w:val="Hyperlink"/>
-                <w:rFonts w:ascii="Aptos" w:hAnsi="Aptos"/>
-                <w:noProof/>
-              </w:rPr>
-              <w:t>Table of Contents</w:t>
-            </w:r>
-            <w:r>
-              <w:rPr>
-                <w:noProof/>
-                <w:webHidden/>
-              </w:rPr>
-              <w:tab/>
-            </w:r>
-            <w:r>
-              <w:rPr>
-                <w:noProof/>
-                <w:webHidden/>
-              </w:rPr>
-              <w:fldChar w:fldCharType="begin"/>
-            </w:r>
-            <w:r>
-              <w:rPr>
-                <w:noProof/>
-                <w:webHidden/>
-              </w:rPr>
-              <w:instrText xml:space="preserve"> PAGEREF _Toc227574465 \h </w:instrText>
-            </w:r>
-            <w:r>
-              <w:rPr>
-                <w:noProof/>
-                <w:webHidden/>
-              </w:rPr>
-            </w:r>
-            <w:r>
-              <w:rPr>
-                <w:noProof/>
-                <w:webHidden/>
-              </w:rPr>
-              <w:fldChar w:fldCharType="separate"/>
-            </w:r>
-            <w:r>
-              <w:rPr>
-                <w:noProof/>
-                <w:webHidden/>
-              </w:rPr>
-              <w:t>2</w:t>
-            </w:r>
-            <w:r>
-              <w:rPr>
-                <w:noProof/>
-                <w:webHidden/>
-              </w:rPr>
-              <w:fldChar w:fldCharType="end"/>
-            </w:r>
-          </w:hyperlink>
-        </w:p>
-        <w:p>
-          <w:pPr>
-            <w:pStyle w:val="TOC1"/>
-            <w:rPr>
-              <w:noProof/>
-              <w:kern w:val="2"/>
-              <w:sz w:val="24"/>
-              <w:szCs w:val="24"/>
-              <w:lang w:val="en-ZA" w:eastAsia="en-ZA"/>
-              <w14:ligatures w14:val="standardContextual"/>
-            </w:rPr>
-          </w:pPr>
-          <w:hyperlink w:anchor="_Toc227574466" w:history="1">
+          <w:hyperlink w:anchor="_Toc230720645" w:history="1">
             <w:r>
               <w:rPr>
                 <w:rStyle w:val="Hyperlink"/>
@@ -362,7 +218,7 @@
                 <w:noProof/>
                 <w:webHidden/>
               </w:rPr>
-              <w:instrText xml:space="preserve"> PAGEREF _Toc227574466 \h </w:instrText>
+              <w:instrText xml:space="preserve"> PAGEREF _Toc230720645 \h </w:instrText>
             </w:r>
             <w:r>
               <w:rPr>
@@ -408,7 +264,7 @@
               <w14:ligatures w14:val="standardContextual"/>
             </w:rPr>
           </w:pPr>
-          <w:hyperlink w:anchor="_Toc227574467" w:history="1">
+          <w:hyperlink w:anchor="_Toc230720646" w:history="1">
             <w:r>
               <w:rPr>
                 <w:rStyle w:val="Hyperlink"/>
@@ -436,7 +292,7 @@
                 <w:noProof/>
                 <w:webHidden/>
               </w:rPr>
-              <w:instrText xml:space="preserve"> PAGEREF _Toc227574467 \h </w:instrText>
+              <w:instrText xml:space="preserve"> PAGEREF _Toc230720646 \h </w:instrText>
             </w:r>
             <w:r>
               <w:rPr>
@@ -482,7 +338,7 @@
               <w14:ligatures w14:val="standardContextual"/>
             </w:rPr>
           </w:pPr>
-          <w:hyperlink w:anchor="_Toc227574468" w:history="1">
+          <w:hyperlink w:anchor="_Toc230720647" w:history="1">
             <w:r>
               <w:rPr>
                 <w:rStyle w:val="Hyperlink"/>
@@ -510,7 +366,7 @@
                 <w:noProof/>
                 <w:webHidden/>
               </w:rPr>
-              <w:instrText xml:space="preserve"> PAGEREF _Toc227574468 \h </w:instrText>
+              <w:instrText xml:space="preserve"> PAGEREF _Toc230720647 \h </w:instrText>
             </w:r>
             <w:r>
               <w:rPr>
@@ -556,7 +412,7 @@
               <w14:ligatures w14:val="standardContextual"/>
             </w:rPr>
           </w:pPr>
-          <w:hyperlink w:anchor="_Toc227574469" w:history="1">
+          <w:hyperlink w:anchor="_Toc230720648" w:history="1">
             <w:r>
               <w:rPr>
                 <w:rStyle w:val="Hyperlink"/>
@@ -584,226 +440,7 @@
                 <w:noProof/>
                 <w:webHidden/>
               </w:rPr>
-              <w:instrText xml:space="preserve"> PAGEREF _Toc227574469 \h </w:instrText>
-            </w:r>
-            <w:r>
-              <w:rPr>
-                <w:noProof/>
-                <w:webHidden/>
-              </w:rPr>
-            </w:r>
-            <w:r>
-              <w:rPr>
-                <w:noProof/>
-                <w:webHidden/>
-              </w:rPr>
-              <w:fldChar w:fldCharType="separate"/>
-            </w:r>
-            <w:r>
-              <w:rPr>
-                <w:noProof/>
-                <w:webHidden/>
-              </w:rPr>
-              <w:t>3</w:t>
-            </w:r>
-            <w:r>
-              <w:rPr>
-                <w:noProof/>
-                <w:webHidden/>
-              </w:rPr>
-              <w:fldChar w:fldCharType="end"/>
-            </w:r>
-          </w:hyperlink>
-        </w:p>
-        <w:p>
-          <w:pPr>
-            <w:pStyle w:val="TOC2"/>
-            <w:tabs>
-              <w:tab w:val="right" w:leader="dot" w:pos="8630"/>
-            </w:tabs>
-            <w:rPr>
-              <w:noProof/>
-              <w:kern w:val="2"/>
-              <w:sz w:val="24"/>
-              <w:szCs w:val="24"/>
-              <w:lang w:val="en-ZA" w:eastAsia="en-ZA"/>
-              <w14:ligatures w14:val="standardContextual"/>
-            </w:rPr>
-          </w:pPr>
-          <w:hyperlink w:anchor="_Toc227574470" w:history="1">
-            <w:r>
-              <w:rPr>
-                <w:rStyle w:val="Hyperlink"/>
-                <w:rFonts w:ascii="Aptos" w:hAnsi="Aptos"/>
-                <w:noProof/>
-              </w:rPr>
-              <w:t>4. Features and Functionality                                                                                                                              A homepage, menu page, contact page, about us page, gallery page, and online ordering system will all be part of the website. Promotions are extra features.</w:t>
-            </w:r>
-            <w:r>
-              <w:rPr>
-                <w:noProof/>
-                <w:webHidden/>
-              </w:rPr>
-              <w:tab/>
-            </w:r>
-            <w:r>
-              <w:rPr>
-                <w:noProof/>
-                <w:webHidden/>
-              </w:rPr>
-              <w:fldChar w:fldCharType="begin"/>
-            </w:r>
-            <w:r>
-              <w:rPr>
-                <w:noProof/>
-                <w:webHidden/>
-              </w:rPr>
-              <w:instrText xml:space="preserve"> PAGEREF _Toc227574470 \h </w:instrText>
-            </w:r>
-            <w:r>
-              <w:rPr>
-                <w:noProof/>
-                <w:webHidden/>
-              </w:rPr>
-            </w:r>
-            <w:r>
-              <w:rPr>
-                <w:noProof/>
-                <w:webHidden/>
-              </w:rPr>
-              <w:fldChar w:fldCharType="separate"/>
-            </w:r>
-            <w:r>
-              <w:rPr>
-                <w:noProof/>
-                <w:webHidden/>
-              </w:rPr>
-              <w:t>3</w:t>
-            </w:r>
-            <w:r>
-              <w:rPr>
-                <w:noProof/>
-                <w:webHidden/>
-              </w:rPr>
-              <w:fldChar w:fldCharType="end"/>
-            </w:r>
-          </w:hyperlink>
-        </w:p>
-        <w:p>
-          <w:pPr>
-            <w:pStyle w:val="TOC1"/>
-            <w:rPr>
-              <w:noProof/>
-              <w:kern w:val="2"/>
-              <w:sz w:val="24"/>
-              <w:szCs w:val="24"/>
-              <w:lang w:val="en-ZA" w:eastAsia="en-ZA"/>
-              <w14:ligatures w14:val="standardContextual"/>
-            </w:rPr>
-          </w:pPr>
-          <w:hyperlink w:anchor="_Toc227574471" w:history="1">
-            <w:r>
-              <w:rPr>
-                <w:rStyle w:val="Hyperlink"/>
-                <w:rFonts w:ascii="Aptos" w:hAnsi="Aptos"/>
-                <w:noProof/>
-              </w:rPr>
-              <w:t>5. Design and UX                                                                                                                                                 Warm colors like cream and brown will be used in the design to represent the company identity. The design will be straightforward, tidy, and easy to use. The navigation will be responsive to mobile devices and easy to use.</w:t>
-            </w:r>
-            <w:r>
-              <w:rPr>
-                <w:noProof/>
-                <w:webHidden/>
-              </w:rPr>
-              <w:tab/>
-            </w:r>
-            <w:r>
-              <w:rPr>
-                <w:noProof/>
-                <w:webHidden/>
-              </w:rPr>
-              <w:fldChar w:fldCharType="begin"/>
-            </w:r>
-            <w:r>
-              <w:rPr>
-                <w:noProof/>
-                <w:webHidden/>
-              </w:rPr>
-              <w:instrText xml:space="preserve"> PAGEREF _Toc227574471 \h </w:instrText>
-            </w:r>
-            <w:r>
-              <w:rPr>
-                <w:noProof/>
-                <w:webHidden/>
-              </w:rPr>
-            </w:r>
-            <w:r>
-              <w:rPr>
-                <w:noProof/>
-                <w:webHidden/>
-              </w:rPr>
-              <w:fldChar w:fldCharType="separate"/>
-            </w:r>
-            <w:r>
-              <w:rPr>
-                <w:noProof/>
-                <w:webHidden/>
-              </w:rPr>
-              <w:t>3</w:t>
-            </w:r>
-            <w:r>
-              <w:rPr>
-                <w:noProof/>
-                <w:webHidden/>
-              </w:rPr>
-              <w:fldChar w:fldCharType="end"/>
-            </w:r>
-          </w:hyperlink>
-        </w:p>
-        <w:p>
-          <w:pPr>
-            <w:pStyle w:val="TOC2"/>
-            <w:tabs>
-              <w:tab w:val="right" w:leader="dot" w:pos="8630"/>
-            </w:tabs>
-            <w:rPr>
-              <w:noProof/>
-              <w:kern w:val="2"/>
-              <w:sz w:val="24"/>
-              <w:szCs w:val="24"/>
-              <w:lang w:val="en-ZA" w:eastAsia="en-ZA"/>
-              <w14:ligatures w14:val="standardContextual"/>
-            </w:rPr>
-          </w:pPr>
-          <w:hyperlink w:anchor="_Toc227574472" w:history="1">
-            <w:r>
-              <w:rPr>
-                <w:rStyle w:val="Hyperlink"/>
-                <w:rFonts w:ascii="Aptos" w:hAnsi="Aptos"/>
-                <w:noProof/>
-              </w:rPr>
-              <w:t>6. Wireframe</w:t>
-            </w:r>
-            <w:r>
-              <w:rPr>
-                <w:noProof/>
-                <w:webHidden/>
-              </w:rPr>
-              <w:tab/>
-            </w:r>
-            <w:r>
-              <w:rPr>
-                <w:noProof/>
-                <w:webHidden/>
-              </w:rPr>
-              <w:fldChar w:fldCharType="begin"/>
-            </w:r>
-            <w:r>
-              <w:rPr>
-                <w:noProof/>
-                <w:webHidden/>
-              </w:rPr>
-              <w:instrText xml:space="preserve"> PAGEREF _Toc227574472 \h </w:instrText>
+              <w:instrText xml:space="preserve"> PAGEREF _Toc230720648 \h </w:instrText>
             </w:r>
             <w:r>
               <w:rPr>
@@ -849,14 +486,13 @@
               <w14:ligatures w14:val="standardContextual"/>
             </w:rPr>
           </w:pPr>
-          <w:hyperlink w:anchor="_Toc227574473" w:history="1">
+          <w:hyperlink w:anchor="_Toc230720649" w:history="1">
             <w:r>
               <w:rPr>
                 <w:rStyle w:val="Hyperlink"/>
-                <w:rFonts w:ascii="Aptos" w:hAnsi="Aptos"/>
                 <w:noProof/>
               </w:rPr>
-              <w:t>7. Technical Requirements                                                                                                                                  HTML will be used in the construction of the website.</w:t>
+              <w:t>4. Features and Functionality</w:t>
             </w:r>
             <w:r>
               <w:rPr>
@@ -877,7 +513,7 @@
                 <w:noProof/>
                 <w:webHidden/>
               </w:rPr>
-              <w:instrText xml:space="preserve"> PAGEREF _Toc227574473 \h </w:instrText>
+              <w:instrText xml:space="preserve"> PAGEREF _Toc230720649 \h </w:instrText>
             </w:r>
             <w:r>
               <w:rPr>
@@ -923,14 +559,13 @@
               <w14:ligatures w14:val="standardContextual"/>
             </w:rPr>
           </w:pPr>
-          <w:hyperlink w:anchor="_Toc227574474" w:history="1">
+          <w:hyperlink w:anchor="_Toc230720650" w:history="1">
             <w:r>
               <w:rPr>
                 <w:rStyle w:val="Hyperlink"/>
-                <w:rFonts w:ascii="Aptos" w:hAnsi="Aptos"/>
                 <w:noProof/>
               </w:rPr>
-              <w:t>8. Timeline</w:t>
+              <w:t>5. Design and UX</w:t>
             </w:r>
             <w:r>
               <w:rPr>
@@ -951,7 +586,7 @@
                 <w:noProof/>
                 <w:webHidden/>
               </w:rPr>
-              <w:instrText xml:space="preserve"> PAGEREF _Toc227574474 \h </w:instrText>
+              <w:instrText xml:space="preserve"> PAGEREF _Toc230720650 \h </w:instrText>
             </w:r>
             <w:r>
               <w:rPr>
@@ -997,14 +632,14 @@
               <w14:ligatures w14:val="standardContextual"/>
             </w:rPr>
           </w:pPr>
-          <w:hyperlink w:anchor="_Toc227574475" w:history="1">
+          <w:hyperlink w:anchor="_Toc230720651" w:history="1">
             <w:r>
               <w:rPr>
                 <w:rStyle w:val="Hyperlink"/>
                 <w:rFonts w:ascii="Aptos" w:hAnsi="Aptos"/>
                 <w:noProof/>
               </w:rPr>
-              <w:t>9. Budget</w:t>
+              <w:t>6. Wireframe</w:t>
             </w:r>
             <w:r>
               <w:rPr>
@@ -1025,7 +660,7 @@
                 <w:noProof/>
                 <w:webHidden/>
               </w:rPr>
-              <w:instrText xml:space="preserve"> PAGEREF _Toc227574475 \h </w:instrText>
+              <w:instrText xml:space="preserve"> PAGEREF _Toc230720651 \h </w:instrText>
             </w:r>
             <w:r>
               <w:rPr>
@@ -1058,7 +693,10 @@
         </w:p>
         <w:p>
           <w:pPr>
-            <w:pStyle w:val="TOC1"/>
+            <w:pStyle w:val="TOC2"/>
+            <w:tabs>
+              <w:tab w:val="right" w:leader="dot" w:pos="8630"/>
+            </w:tabs>
             <w:rPr>
               <w:noProof/>
               <w:kern w:val="2"/>
@@ -1068,15 +706,13 @@
               <w14:ligatures w14:val="standardContextual"/>
             </w:rPr>
           </w:pPr>
-          <w:hyperlink w:anchor="_Toc227574476" w:history="1">
+          <w:hyperlink w:anchor="_Toc230720652" w:history="1">
             <w:r>
               <w:rPr>
                 <w:rStyle w:val="Hyperlink"/>
-                <w:rFonts w:ascii="Aptos" w:hAnsi="Aptos"/>
                 <w:noProof/>
-                <w:lang w:val="en-ZA"/>
               </w:rPr>
-              <w:t>References</w:t>
+              <w:t>7. Technical Requirements</w:t>
             </w:r>
             <w:r>
               <w:rPr>
@@ -1097,7 +733,155 @@
                 <w:noProof/>
                 <w:webHidden/>
               </w:rPr>
-              <w:instrText xml:space="preserve"> PAGEREF _Toc227574476 \h </w:instrText>
+              <w:instrText xml:space="preserve"> PAGEREF _Toc230720652 \h </w:instrText>
+            </w:r>
+            <w:r>
+              <w:rPr>
+                <w:noProof/>
+                <w:webHidden/>
+              </w:rPr>
+            </w:r>
+            <w:r>
+              <w:rPr>
+                <w:noProof/>
+                <w:webHidden/>
+              </w:rPr>
+              <w:fldChar w:fldCharType="separate"/>
+            </w:r>
+            <w:r>
+              <w:rPr>
+                <w:noProof/>
+                <w:webHidden/>
+              </w:rPr>
+              <w:t>5</w:t>
+            </w:r>
+            <w:r>
+              <w:rPr>
+                <w:noProof/>
+                <w:webHidden/>
+              </w:rPr>
+              <w:fldChar w:fldCharType="end"/>
+            </w:r>
+          </w:hyperlink>
+        </w:p>
+        <w:p>
+          <w:pPr>
+            <w:pStyle w:val="TOC2"/>
+            <w:tabs>
+              <w:tab w:val="right" w:leader="dot" w:pos="8630"/>
+            </w:tabs>
+            <w:rPr>
+              <w:noProof/>
+              <w:kern w:val="2"/>
+              <w:sz w:val="24"/>
+              <w:szCs w:val="24"/>
+              <w:lang w:val="en-ZA" w:eastAsia="en-ZA"/>
+              <w14:ligatures w14:val="standardContextual"/>
+            </w:rPr>
+          </w:pPr>
+          <w:hyperlink w:anchor="_Toc230720653" w:history="1">
+            <w:r>
+              <w:rPr>
+                <w:rStyle w:val="Hyperlink"/>
+                <w:rFonts w:ascii="Aptos" w:hAnsi="Aptos"/>
+                <w:noProof/>
+              </w:rPr>
+              <w:t>8. Timeline</w:t>
+            </w:r>
+            <w:r>
+              <w:rPr>
+                <w:noProof/>
+                <w:webHidden/>
+              </w:rPr>
+              <w:tab/>
+            </w:r>
+            <w:r>
+              <w:rPr>
+                <w:noProof/>
+                <w:webHidden/>
+              </w:rPr>
+              <w:fldChar w:fldCharType="begin"/>
+            </w:r>
+            <w:r>
+              <w:rPr>
+                <w:noProof/>
+                <w:webHidden/>
+              </w:rPr>
+              <w:instrText xml:space="preserve"> PAGEREF _Toc230720653 \h </w:instrText>
+            </w:r>
+            <w:r>
+              <w:rPr>
+                <w:noProof/>
+                <w:webHidden/>
+              </w:rPr>
+            </w:r>
+            <w:r>
+              <w:rPr>
+                <w:noProof/>
+                <w:webHidden/>
+              </w:rPr>
+              <w:fldChar w:fldCharType="separate"/>
+            </w:r>
+            <w:r>
+              <w:rPr>
+                <w:noProof/>
+                <w:webHidden/>
+              </w:rPr>
+              <w:t>5</w:t>
+            </w:r>
+            <w:r>
+              <w:rPr>
+                <w:noProof/>
+                <w:webHidden/>
+              </w:rPr>
+              <w:fldChar w:fldCharType="end"/>
+            </w:r>
+          </w:hyperlink>
+        </w:p>
+        <w:p>
+          <w:pPr>
+            <w:pStyle w:val="TOC2"/>
+            <w:tabs>
+              <w:tab w:val="right" w:leader="dot" w:pos="8630"/>
+            </w:tabs>
+            <w:rPr>
+              <w:noProof/>
+              <w:kern w:val="2"/>
+              <w:sz w:val="24"/>
+              <w:szCs w:val="24"/>
+              <w:lang w:val="en-ZA" w:eastAsia="en-ZA"/>
+              <w14:ligatures w14:val="standardContextual"/>
+            </w:rPr>
+          </w:pPr>
+          <w:hyperlink w:anchor="_Toc230720654" w:history="1">
+            <w:r>
+              <w:rPr>
+                <w:rStyle w:val="Hyperlink"/>
+                <w:rFonts w:ascii="Aptos" w:hAnsi="Aptos"/>
+                <w:noProof/>
+              </w:rPr>
+              <w:t>9. Budget</w:t>
+            </w:r>
+            <w:r>
+              <w:rPr>
+                <w:noProof/>
+                <w:webHidden/>
+              </w:rPr>
+              <w:tab/>
+            </w:r>
+            <w:r>
+              <w:rPr>
+                <w:noProof/>
+                <w:webHidden/>
+              </w:rPr>
+              <w:fldChar w:fldCharType="begin"/>
+            </w:r>
+            <w:r>
+              <w:rPr>
+                <w:noProof/>
+                <w:webHidden/>
+              </w:rPr>
+              <w:instrText xml:space="preserve"> PAGEREF _Toc230720654 \h </w:instrText>
             </w:r>
             <w:r>
               <w:rPr>
@@ -1173,9 +957,43 @@
     </w:p>
     <w:p>
       <w:pPr>
-        <w:spacing w:line="360" w:lineRule="auto"/>
         <w:rPr>
           <w:lang w:val="en-ZA"/>
+        </w:rPr>
+      </w:pPr>
+    </w:p>
+    <w:p>
+      <w:pPr>
+        <w:rPr>
+          <w:rFonts w:ascii="Aptos" w:hAnsi="Aptos"/>
+        </w:rPr>
+      </w:pPr>
+    </w:p>
+    <w:p>
+      <w:pPr>
+        <w:rPr>
+          <w:rFonts w:ascii="Aptos" w:hAnsi="Aptos"/>
+        </w:rPr>
+      </w:pPr>
+    </w:p>
+    <w:p>
+      <w:pPr>
+        <w:rPr>
+          <w:rFonts w:ascii="Aptos" w:hAnsi="Aptos"/>
+        </w:rPr>
+      </w:pPr>
+    </w:p>
+    <w:p>
+      <w:pPr>
+        <w:rPr>
+          <w:rFonts w:ascii="Aptos" w:hAnsi="Aptos"/>
+        </w:rPr>
+      </w:pPr>
+    </w:p>
+    <w:p>
+      <w:pPr>
+        <w:rPr>
+          <w:rFonts w:ascii="Aptos" w:hAnsi="Aptos"/>
         </w:rPr>
       </w:pPr>
     </w:p>
@@ -1189,7 +1007,7 @@
           <w:szCs w:val="22"/>
         </w:rPr>
       </w:pPr>
-      <w:bookmarkStart w:id="1" w:name="_Toc227574466"/>
+      <w:bookmarkStart w:id="0" w:name="_Toc230720645"/>
       <w:r>
         <w:rPr>
           <w:rFonts w:ascii="Aptos" w:hAnsi="Aptos"/>
@@ -1199,7 +1017,7 @@
         <w:lastRenderedPageBreak/>
         <w:t>Proposal 1: Urban Brew Coffee Website</w:t>
       </w:r>
-      <w:bookmarkEnd w:id="1"/>
+      <w:bookmarkEnd w:id="0"/>
     </w:p>
     <w:p>
       <w:pPr>
@@ -1211,7 +1029,7 @@
           <w:szCs w:val="22"/>
         </w:rPr>
       </w:pPr>
-      <w:bookmarkStart w:id="2" w:name="_Toc227574467"/>
+      <w:bookmarkStart w:id="1" w:name="_Toc230720646"/>
       <w:r>
         <w:rPr>
           <w:rFonts w:ascii="Aptos" w:hAnsi="Aptos"/>
@@ -1220,7 +1038,7 @@
         </w:rPr>
         <w:t>1. Organization Overview</w:t>
       </w:r>
-      <w:bookmarkEnd w:id="2"/>
+      <w:bookmarkEnd w:id="1"/>
     </w:p>
     <w:p>
       <w:pPr>
@@ -1259,7 +1077,7 @@
           <w:szCs w:val="22"/>
         </w:rPr>
       </w:pPr>
-      <w:bookmarkStart w:id="3" w:name="_Toc227574468"/>
+      <w:bookmarkStart w:id="2" w:name="_Toc230720647"/>
       <w:r>
         <w:rPr>
           <w:rFonts w:ascii="Aptos" w:hAnsi="Aptos"/>
@@ -1268,7 +1086,7 @@
         </w:rPr>
         <w:t>2. Website Goals and Objectives</w:t>
       </w:r>
-      <w:bookmarkEnd w:id="3"/>
+      <w:bookmarkEnd w:id="2"/>
     </w:p>
     <w:p>
       <w:pPr>
@@ -1282,14 +1100,53 @@
         <w:rPr>
           <w:rFonts w:ascii="Aptos" w:hAnsi="Aptos"/>
         </w:rPr>
-        <w:t>The website's objectives are to raise brand awareness, draw in new clients, and offer an online buying system. It will act as a focal point for promotions and information.</w:t>
+        <w:t xml:space="preserve">The primary goal of the Urban Brew Coffee website is to establish a strong online presence for the business and improve customer engagement. The website aims to increase brand awareness by promoting the coffee shop’s products, services, promotions, and company values to a wider audience. </w:t>
       </w:r>
       <w:r>
         <w:rPr>
           <w:rFonts w:ascii="Aptos" w:hAnsi="Aptos"/>
         </w:rPr>
         <w:br/>
-        <w:t xml:space="preserve">Increased traffic, online sales, and customer interaction indicators are examples of KPIs </w:t>
+      </w:r>
+      <w:r>
+        <w:rPr>
+          <w:rFonts w:ascii="Aptos" w:hAnsi="Aptos"/>
+        </w:rPr>
+        <w:br/>
+        <w:t>Another important objective is to provide customers with an easy and convenient online ordering experience. Customers should be able to browse the menu, view pricing, and place orders online without difficulty. The website will also improve communication between the business and customers through contact forms and social media integration.</w:t>
+      </w:r>
+      <w:r>
+        <w:rPr>
+          <w:rFonts w:ascii="Aptos" w:hAnsi="Aptos"/>
+        </w:rPr>
+        <w:br/>
+      </w:r>
+      <w:r>
+        <w:rPr>
+          <w:rFonts w:ascii="Aptos" w:hAnsi="Aptos"/>
+        </w:rPr>
+        <w:br/>
+        <w:t>The website additionally aims to improve customer satisfaction by providing a responsive and user-friendly design that functions well on desktops, tablets, and mobile devices. The business hopes to increase sales, attract new customers, and retain existing customers through an attractive and informative online platform.</w:t>
+      </w:r>
+      <w:r>
+        <w:rPr>
+          <w:rFonts w:ascii="Aptos" w:hAnsi="Aptos"/>
+        </w:rPr>
+        <w:br/>
+      </w:r>
+      <w:r>
+        <w:rPr>
+          <w:rFonts w:ascii="Aptos" w:hAnsi="Aptos"/>
+        </w:rPr>
+        <w:br/>
+        <w:t>Key Performance Indicators (KPIs) that will be used to measure success include increased website traffic, higher online order volumes, customer engagement on the website, and improved social media interaction.</w:t>
+      </w:r>
+      <w:r>
+        <w:rPr>
+          <w:rFonts w:ascii="Aptos" w:hAnsi="Aptos"/>
+          <w:lang w:val="en-ZA"/>
+        </w:rPr>
+        <w:t xml:space="preserve"> </w:t>
       </w:r>
       <w:r>
         <w:rPr>
@@ -1309,16 +1166,17 @@
           <w:szCs w:val="22"/>
         </w:rPr>
       </w:pPr>
-      <w:bookmarkStart w:id="4" w:name="_Toc227574469"/>
+      <w:bookmarkStart w:id="3" w:name="_Toc230720648"/>
       <w:r>
         <w:rPr>
           <w:rFonts w:ascii="Aptos" w:hAnsi="Aptos"/>
           <w:sz w:val="22"/>
           <w:szCs w:val="22"/>
         </w:rPr>
+        <w:lastRenderedPageBreak/>
         <w:t>3. Current Website Analysis</w:t>
       </w:r>
-      <w:bookmarkEnd w:id="4"/>
+      <w:bookmarkEnd w:id="3"/>
     </w:p>
     <w:p>
       <w:pPr>
@@ -1342,76 +1200,50 @@
       </w:r>
     </w:p>
     <w:p>
-      <w:pPr>
-        <w:pStyle w:val="Heading2"/>
-        <w:spacing w:line="360" w:lineRule="auto"/>
-        <w:rPr>
-          <w:rFonts w:ascii="Aptos" w:hAnsi="Aptos"/>
-          <w:sz w:val="22"/>
-          <w:szCs w:val="22"/>
-        </w:rPr>
-      </w:pPr>
-      <w:bookmarkStart w:id="5" w:name="_Toc227574470"/>
+      <w:bookmarkStart w:id="4" w:name="_Toc230720649"/>
       <w:r>
         <w:rPr>
-          <w:rFonts w:ascii="Aptos" w:hAnsi="Aptos"/>
-          <w:sz w:val="22"/>
-          <w:szCs w:val="22"/>
+          <w:rStyle w:val="Heading2Char"/>
         </w:rPr>
-        <w:t xml:space="preserve">4. Features and Functionality                                                                                                                              </w:t>
+        <w:t>4. Features and Functionality</w:t>
+      </w:r>
+      <w:bookmarkEnd w:id="4"/>
+      <w:r>
+        <w:rPr>
+          <w:rStyle w:val="Heading2Char"/>
+        </w:rPr>
+        <w:t xml:space="preserve">                                                                                                                              </w:t>
       </w:r>
       <w:r>
-        <w:rPr>
-          <w:rFonts w:ascii="Aptos" w:eastAsiaTheme="minorEastAsia" w:hAnsi="Aptos" w:cstheme="minorBidi"/>
-          <w:b w:val="0"/>
-          <w:bCs w:val="0"/>
-          <w:color w:val="auto"/>
-          <w:sz w:val="22"/>
-          <w:szCs w:val="22"/>
-        </w:rPr>
         <w:t>A homepage, menu page, contact page, about us page, gallery page, and online ordering system will all be part of the website. Promotions are extra features.</w:t>
       </w:r>
-      <w:bookmarkEnd w:id="5"/>
     </w:p>
     <w:p>
       <w:pPr>
-        <w:pStyle w:val="Heading1"/>
-        <w:spacing w:line="360" w:lineRule="auto"/>
-        <w:rPr>
-          <w:rFonts w:ascii="Aptos" w:hAnsi="Aptos"/>
-          <w:sz w:val="22"/>
-          <w:szCs w:val="22"/>
-        </w:rPr>
-      </w:pPr>
-      <w:bookmarkStart w:id="6" w:name="_Toc227574471"/>
-      <w:r>
-        <w:rPr>
-          <w:rFonts w:ascii="Aptos" w:hAnsi="Aptos"/>
-          <w:sz w:val="22"/>
-          <w:szCs w:val="22"/>
-        </w:rPr>
-        <w:t xml:space="preserve">5. Design and UX                                                                                                                                                 </w:t>
-      </w:r>
-      <w:r>
-        <w:rPr>
-          <w:rFonts w:ascii="Aptos" w:eastAsiaTheme="minorEastAsia" w:hAnsi="Aptos" w:cstheme="minorBidi"/>
-          <w:b w:val="0"/>
-          <w:bCs w:val="0"/>
-          <w:color w:val="auto"/>
-          <w:sz w:val="22"/>
-          <w:szCs w:val="22"/>
-        </w:rPr>
-        <w:t>Warm colors like cream and brown will be used in the design to represent the company identity. The design will be straightforward, tidy, and easy to use. The navigation will be responsive to mobile devices and easy to use.</w:t>
-      </w:r>
-      <w:bookmarkEnd w:id="6"/>
-    </w:p>
-    <w:p>
-      <w:pPr>
-        <w:spacing w:line="360" w:lineRule="auto"/>
         <w:rPr>
           <w:rFonts w:ascii="Aptos" w:hAnsi="Aptos"/>
         </w:rPr>
       </w:pPr>
+      <w:bookmarkStart w:id="5" w:name="_Toc230720650"/>
+      <w:r>
+        <w:rPr>
+          <w:rStyle w:val="Heading2Char"/>
+        </w:rPr>
+        <w:t>5. Design and UX</w:t>
+      </w:r>
+      <w:bookmarkEnd w:id="5"/>
+      <w:r>
+        <w:rPr>
+          <w:rStyle w:val="Heading2Char"/>
+        </w:rPr>
+        <w:t xml:space="preserve">                                                                                                                                                 </w:t>
+      </w:r>
+      <w:r>
+        <w:rPr>
+          <w:rFonts w:ascii="Aptos" w:hAnsi="Aptos"/>
+        </w:rPr>
+        <w:t>Warm colors like cream and brown will be used in the design to represent the company identity. The design will be straightforward, tidy, and easy to use. The navigation will be responsive to mobile devices and easy to use.</w:t>
+      </w:r>
     </w:p>
     <w:p>
       <w:pPr>
@@ -1423,17 +1255,16 @@
           <w:szCs w:val="22"/>
         </w:rPr>
       </w:pPr>
-      <w:bookmarkStart w:id="7" w:name="_Toc227574472"/>
+      <w:bookmarkStart w:id="6" w:name="_Toc230720651"/>
       <w:r>
         <w:rPr>
           <w:rFonts w:ascii="Aptos" w:hAnsi="Aptos"/>
           <w:sz w:val="22"/>
           <w:szCs w:val="22"/>
         </w:rPr>
-        <w:lastRenderedPageBreak/>
         <w:t>6. Wireframe</w:t>
       </w:r>
-      <w:bookmarkEnd w:id="7"/>
+      <w:bookmarkEnd w:id="6"/>
     </w:p>
     <w:p>
       <w:pPr>
@@ -1486,90 +1317,40 @@
     </w:p>
     <w:p>
       <w:pPr>
-        <w:pStyle w:val="Heading2"/>
-        <w:spacing w:line="360" w:lineRule="auto"/>
         <w:rPr>
-          <w:rFonts w:ascii="Aptos" w:hAnsi="Aptos"/>
-          <w:sz w:val="22"/>
-          <w:szCs w:val="22"/>
+          <w:rStyle w:val="Heading2Char"/>
         </w:rPr>
       </w:pPr>
-      <w:bookmarkStart w:id="8" w:name="_Toc227574473"/>
-      <w:r>
-        <w:rPr>
-          <w:rFonts w:ascii="Aptos" w:hAnsi="Aptos"/>
-          <w:sz w:val="22"/>
-          <w:szCs w:val="22"/>
-        </w:rPr>
-        <w:t xml:space="preserve">7. Technical Requirements                                                                                                                                  </w:t>
-      </w:r>
-      <w:r>
-        <w:rPr>
-          <w:rFonts w:ascii="Aptos" w:eastAsiaTheme="minorEastAsia" w:hAnsi="Aptos" w:cstheme="minorBidi"/>
-          <w:b w:val="0"/>
-          <w:bCs w:val="0"/>
-          <w:color w:val="auto"/>
-          <w:sz w:val="22"/>
-          <w:szCs w:val="22"/>
-        </w:rPr>
-        <w:t>HTML will be used in the construction of the website.</w:t>
-      </w:r>
-      <w:bookmarkEnd w:id="8"/>
     </w:p>
     <w:p>
       <w:pPr>
-        <w:pStyle w:val="Heading2"/>
-        <w:spacing w:line="360" w:lineRule="auto"/>
-        <w:rPr>
-          <w:rFonts w:ascii="Aptos" w:hAnsi="Aptos"/>
-          <w:sz w:val="22"/>
-          <w:szCs w:val="22"/>
-        </w:rPr>
-      </w:pPr>
-      <w:bookmarkStart w:id="9" w:name="_Toc227574474"/>
-      <w:r>
-        <w:rPr>
-          <w:rFonts w:ascii="Aptos" w:hAnsi="Aptos"/>
-          <w:sz w:val="22"/>
-          <w:szCs w:val="22"/>
-        </w:rPr>
-        <w:t>8. Timeline</w:t>
-      </w:r>
-      <w:bookmarkEnd w:id="9"/>
-    </w:p>
-    <w:p>
-      <w:pPr>
-        <w:spacing w:line="360" w:lineRule="auto"/>
         <w:rPr>
           <w:rFonts w:ascii="Aptos" w:hAnsi="Aptos"/>
         </w:rPr>
       </w:pPr>
+      <w:bookmarkStart w:id="7" w:name="_Toc230720652"/>
       <w:r>
         <w:rPr>
-          <w:rFonts w:ascii="Aptos" w:hAnsi="Aptos"/>
+          <w:rStyle w:val="Heading2Char"/>
         </w:rPr>
-        <w:t>Week 1–2: Planning and design</w:t>
+        <w:lastRenderedPageBreak/>
+        <w:t>7. Technical Requirements</w:t>
+      </w:r>
+      <w:bookmarkEnd w:id="7"/>
+      <w:r>
+        <w:rPr>
+          <w:rStyle w:val="Heading2Char"/>
+        </w:rPr>
+        <w:t xml:space="preserve">                                                                                                                                  </w:t>
       </w:r>
       <w:r>
-        <w:rPr>
-          <w:rFonts w:ascii="Aptos" w:hAnsi="Aptos"/>
-        </w:rPr>
-        <w:br/>
-        <w:t>Week 3–4: Development</w:t>
+        <w:t>HTML</w:t>
       </w:r>
       <w:r>
-        <w:rPr>
-          <w:rFonts w:ascii="Aptos" w:hAnsi="Aptos"/>
-        </w:rPr>
-        <w:br/>
-        <w:t>Week 5: Testing</w:t>
+        <w:t>, CSS</w:t>
       </w:r>
       <w:r>
-        <w:rPr>
-          <w:rFonts w:ascii="Aptos" w:hAnsi="Aptos"/>
-        </w:rPr>
-        <w:br/>
-        <w:t>Week 6: Launch</w:t>
+        <w:t xml:space="preserve"> will be used in the construction of the website.</w:t>
       </w:r>
     </w:p>
     <w:p>
@@ -1582,7 +1363,163 @@
           <w:szCs w:val="22"/>
         </w:rPr>
       </w:pPr>
-      <w:bookmarkStart w:id="10" w:name="_Toc227574475"/>
+      <w:bookmarkStart w:id="8" w:name="_Toc230720653"/>
+      <w:r>
+        <w:rPr>
+          <w:rFonts w:ascii="Aptos" w:hAnsi="Aptos"/>
+          <w:sz w:val="22"/>
+          <w:szCs w:val="22"/>
+        </w:rPr>
+        <w:t>8. Timeline</w:t>
+      </w:r>
+      <w:bookmarkEnd w:id="8"/>
+    </w:p>
+    <w:p>
+      <w:pPr>
+        <w:rPr>
+          <w:b/>
+          <w:bCs/>
+        </w:rPr>
+      </w:pPr>
+      <w:r>
+        <w:rPr>
+          <w:b/>
+          <w:bCs/>
+        </w:rPr>
+        <w:t>Week 1:</w:t>
+      </w:r>
+    </w:p>
+    <w:p>
+      <w:r>
+        <w:t>Conduct research on similar coffee shop websites, gather business requirements, and create initial wireframes and design ideas.</w:t>
+      </w:r>
+    </w:p>
+    <w:p>
+      <w:pPr>
+        <w:rPr>
+          <w:b/>
+          <w:bCs/>
+        </w:rPr>
+      </w:pPr>
+      <w:r>
+        <w:rPr>
+          <w:b/>
+          <w:bCs/>
+        </w:rPr>
+        <w:t>Week 2:</w:t>
+      </w:r>
+    </w:p>
+    <w:p>
+      <w:r>
+        <w:t xml:space="preserve">Plan the website structure, create the sitemap, </w:t>
+      </w:r>
+      <w:r>
+        <w:t>organize</w:t>
+      </w:r>
+      <w:r>
+        <w:t xml:space="preserve"> content, and prepare images and branding materials for the website.</w:t>
+      </w:r>
+    </w:p>
+    <w:p>
+      <w:pPr>
+        <w:rPr>
+          <w:b/>
+          <w:bCs/>
+        </w:rPr>
+      </w:pPr>
+      <w:r>
+        <w:rPr>
+          <w:b/>
+          <w:bCs/>
+        </w:rPr>
+        <w:t>Week 3:</w:t>
+      </w:r>
+    </w:p>
+    <w:p>
+      <w:r>
+        <w:t>Develop the HTML structure for all web pages including the homepage, menu page, gallery page, about us page, online ordering page, and contact page.</w:t>
+      </w:r>
+    </w:p>
+    <w:p>
+      <w:pPr>
+        <w:rPr>
+          <w:b/>
+          <w:bCs/>
+        </w:rPr>
+      </w:pPr>
+      <w:r>
+        <w:rPr>
+          <w:b/>
+          <w:bCs/>
+        </w:rPr>
+        <w:t>Week 4:</w:t>
+      </w:r>
+    </w:p>
+    <w:p>
+      <w:r>
+        <w:t xml:space="preserve">Apply CSS styling to improve the visual appearance of the website, including typography, </w:t>
+      </w:r>
+      <w:r>
+        <w:t>colors</w:t>
+      </w:r>
+      <w:r>
+        <w:t>, layout design, navigation menus, and responsiveness.</w:t>
+      </w:r>
+    </w:p>
+    <w:p>
+      <w:pPr>
+        <w:rPr>
+          <w:b/>
+          <w:bCs/>
+        </w:rPr>
+      </w:pPr>
+      <w:r>
+        <w:rPr>
+          <w:b/>
+          <w:bCs/>
+        </w:rPr>
+        <w:t>Week 5:</w:t>
+      </w:r>
+    </w:p>
+    <w:p>
+      <w:r>
+        <w:t>Test the website on different devices and screen sizes to ensure responsiveness and usability. Fix bugs, broken links, and layout issues.</w:t>
+      </w:r>
+    </w:p>
+    <w:p>
+      <w:pPr>
+        <w:rPr>
+          <w:b/>
+          <w:bCs/>
+        </w:rPr>
+      </w:pPr>
+      <w:r>
+        <w:rPr>
+          <w:b/>
+          <w:bCs/>
+        </w:rPr>
+        <w:t>Week 6:</w:t>
+      </w:r>
+    </w:p>
+    <w:p>
+      <w:r>
+        <w:t>Finalize</w:t>
+      </w:r>
+      <w:r>
+        <w:t xml:space="preserve"> the website, upload all files to GitHub, deploy the website online, and prepare documentation including the README file and changelog.</w:t>
+      </w:r>
+    </w:p>
+    <w:p>
+      <w:pPr>
+        <w:pStyle w:val="Heading2"/>
+        <w:spacing w:line="360" w:lineRule="auto"/>
+        <w:rPr>
+          <w:rFonts w:ascii="Aptos" w:hAnsi="Aptos"/>
+          <w:sz w:val="22"/>
+          <w:szCs w:val="22"/>
+        </w:rPr>
+      </w:pPr>
+      <w:bookmarkStart w:id="9" w:name="_Toc230720654"/>
       <w:r>
         <w:rPr>
           <w:rFonts w:ascii="Aptos" w:hAnsi="Aptos"/>
@@ -1591,20 +1528,117 @@
         </w:rPr>
         <w:t>9. Budget</w:t>
       </w:r>
-      <w:bookmarkEnd w:id="10"/>
+      <w:bookmarkEnd w:id="9"/>
+    </w:p>
+    <w:p>
+      <w:r>
+        <w:t>The estimated budget for the Urban Brew Coffee website project includes development, hosting, maintenance, and future improvements.</w:t>
+      </w:r>
     </w:p>
     <w:p>
       <w:pPr>
-        <w:spacing w:line="360" w:lineRule="auto"/>
         <w:rPr>
-          <w:rFonts w:ascii="Aptos" w:hAnsi="Aptos"/>
+          <w:b/>
+          <w:bCs/>
         </w:rPr>
       </w:pPr>
       <w:r>
         <w:rPr>
-          <w:rFonts w:ascii="Aptos" w:hAnsi="Aptos"/>
+          <w:b/>
+          <w:bCs/>
         </w:rPr>
-        <w:t>Development (R5,000), hosting (R1,200/year), and maintenance (R500/month) are all included in the estimated cost.</w:t>
+        <w:t>Website Development:</w:t>
+      </w:r>
+    </w:p>
+    <w:p>
+      <w:r>
+        <w:t>The estimated development cost is approximately R5,000. This includes planning, designing, coding, testing, and implementing the website.</w:t>
+      </w:r>
+    </w:p>
+    <w:p>
+      <w:pPr>
+        <w:rPr>
+          <w:b/>
+          <w:bCs/>
+        </w:rPr>
+      </w:pPr>
+      <w:r>
+        <w:rPr>
+          <w:b/>
+          <w:bCs/>
+        </w:rPr>
+        <w:t>Domain and Hosting:</w:t>
+      </w:r>
+    </w:p>
+    <w:p>
+      <w:r>
+        <w:t>Website hosting is estimated at R1,200 per year, while domain registration is estimated at approximately R250 per year.</w:t>
+      </w:r>
+    </w:p>
+    <w:p>
+      <w:pPr>
+        <w:rPr>
+          <w:b/>
+          <w:bCs/>
+        </w:rPr>
+      </w:pPr>
+      <w:r>
+        <w:rPr>
+          <w:b/>
+          <w:bCs/>
+        </w:rPr>
+        <w:lastRenderedPageBreak/>
+        <w:t>Maintenance:</w:t>
+      </w:r>
+    </w:p>
+    <w:p>
+      <w:r>
+        <w:t>Monthly maintenance costs are estimated at R500 per month. This includes updating website content, fixing technical issues, updating images and promotions, and maintaining website security.</w:t>
+      </w:r>
+    </w:p>
+    <w:p>
+      <w:pPr>
+        <w:rPr>
+          <w:b/>
+          <w:bCs/>
+        </w:rPr>
+      </w:pPr>
+      <w:r>
+        <w:rPr>
+          <w:b/>
+          <w:bCs/>
+        </w:rPr>
+        <w:t>Marketing and Advertising:</w:t>
+      </w:r>
+    </w:p>
+    <w:p>
+      <w:r>
+        <w:t>An estimated R1,000 may be allocated towards digital marketing and social media promotions to increase traffic to the website after launch.</w:t>
+      </w:r>
+    </w:p>
+    <w:p>
+      <w:pPr>
+        <w:rPr>
+          <w:b/>
+          <w:bCs/>
+        </w:rPr>
+      </w:pPr>
+      <w:r>
+        <w:rPr>
+          <w:b/>
+          <w:bCs/>
+        </w:rPr>
+        <w:t>Contingency Costs:</w:t>
+      </w:r>
+    </w:p>
+    <w:p>
+      <w:r>
+        <w:t>An additional R500 is reserved for unexpected costs such as software tools, image editing resources, or additional website features.</w:t>
+      </w:r>
+    </w:p>
+    <w:p>
+      <w:r>
+        <w:t>The total estimated first-year cost for the website project is approximately R13,950.</w:t>
       </w:r>
     </w:p>
     <w:p>
@@ -1612,6 +1646,16 @@
         <w:spacing w:line="360" w:lineRule="auto"/>
         <w:rPr>
           <w:rFonts w:ascii="Aptos" w:hAnsi="Aptos"/>
+          <w:lang w:val="en-ZA"/>
+        </w:rPr>
+      </w:pPr>
+    </w:p>
+    <w:p>
+      <w:pPr>
+        <w:spacing w:line="360" w:lineRule="auto"/>
+        <w:rPr>
+          <w:rFonts w:ascii="Aptos" w:hAnsi="Aptos"/>
+          <w:lang w:val="en-ZA"/>
         </w:rPr>
       </w:pPr>
     </w:p>
@@ -1628,7 +1672,6 @@
           <w:rFonts w:ascii="Aptos" w:hAnsi="Aptos"/>
           <w:lang w:val="en-ZA"/>
         </w:rPr>
-        <w:lastRenderedPageBreak/>
         <w:t>Kotler, P. et al.</w:t>
       </w:r>
       <w:r>

</xml_diff>

<commit_message>
made more changes to my website proposal document
</commit_message>
<xml_diff>
--- a/Documents/Website Proposal project.docx
+++ b/Documents/Website Proposal project.docx
@@ -153,6 +153,7 @@
       </w:r>
     </w:p>
     <w:p/>
+    <w:bookmarkStart w:id="0" w:name="_Toc227574465" w:displacedByCustomXml="next"/>
     <w:sdt>
       <w:sdtPr>
         <w:id w:val="-32890298"/>
@@ -167,6 +168,7 @@
         </w:rPr>
       </w:sdtEndPr>
       <w:sdtContent>
+        <w:bookmarkEnd w:id="0" w:displacedByCustomXml="prev"/>
         <w:p/>
         <w:p>
           <w:pPr>
@@ -190,7 +192,149 @@
           <w:r>
             <w:fldChar w:fldCharType="separate"/>
           </w:r>
-          <w:hyperlink w:anchor="_Toc230720645" w:history="1">
+          <w:hyperlink w:anchor="_Toc227574464" w:history="1">
+            <w:r>
+              <w:rPr>
+                <w:rStyle w:val="Hyperlink"/>
+                <w:rFonts w:ascii="Aptos" w:hAnsi="Aptos"/>
+                <w:noProof/>
+              </w:rPr>
+              <w:t>Cover Page</w:t>
+            </w:r>
+            <w:r>
+              <w:rPr>
+                <w:noProof/>
+                <w:webHidden/>
+              </w:rPr>
+              <w:tab/>
+            </w:r>
+            <w:r>
+              <w:rPr>
+                <w:noProof/>
+                <w:webHidden/>
+              </w:rPr>
+              <w:fldChar w:fldCharType="begin"/>
+            </w:r>
+            <w:r>
+              <w:rPr>
+                <w:noProof/>
+                <w:webHidden/>
+              </w:rPr>
+              <w:instrText xml:space="preserve"> PAGEREF _Toc227574464 \h </w:instrText>
+            </w:r>
+            <w:r>
+              <w:rPr>
+                <w:noProof/>
+                <w:webHidden/>
+              </w:rPr>
+            </w:r>
+            <w:r>
+              <w:rPr>
+                <w:noProof/>
+                <w:webHidden/>
+              </w:rPr>
+              <w:fldChar w:fldCharType="separate"/>
+            </w:r>
+            <w:r>
+              <w:rPr>
+                <w:noProof/>
+                <w:webHidden/>
+              </w:rPr>
+              <w:t>1</w:t>
+            </w:r>
+            <w:r>
+              <w:rPr>
+                <w:noProof/>
+                <w:webHidden/>
+              </w:rPr>
+              <w:fldChar w:fldCharType="end"/>
+            </w:r>
+          </w:hyperlink>
+        </w:p>
+        <w:p>
+          <w:pPr>
+            <w:pStyle w:val="TOC1"/>
+            <w:rPr>
+              <w:noProof/>
+              <w:kern w:val="2"/>
+              <w:sz w:val="24"/>
+              <w:szCs w:val="24"/>
+              <w:lang w:val="en-ZA" w:eastAsia="en-ZA"/>
+              <w14:ligatures w14:val="standardContextual"/>
+            </w:rPr>
+          </w:pPr>
+          <w:hyperlink w:anchor="_Toc227574465" w:history="1">
+            <w:r>
+              <w:rPr>
+                <w:rStyle w:val="Hyperlink"/>
+                <w:rFonts w:ascii="Aptos" w:hAnsi="Aptos"/>
+                <w:noProof/>
+              </w:rPr>
+              <w:t>Table of Contents</w:t>
+            </w:r>
+            <w:r>
+              <w:rPr>
+                <w:noProof/>
+                <w:webHidden/>
+              </w:rPr>
+              <w:tab/>
+            </w:r>
+            <w:r>
+              <w:rPr>
+                <w:noProof/>
+                <w:webHidden/>
+              </w:rPr>
+              <w:fldChar w:fldCharType="begin"/>
+            </w:r>
+            <w:r>
+              <w:rPr>
+                <w:noProof/>
+                <w:webHidden/>
+              </w:rPr>
+              <w:instrText xml:space="preserve"> PAGEREF _Toc227574465 \h </w:instrText>
+            </w:r>
+            <w:r>
+              <w:rPr>
+                <w:noProof/>
+                <w:webHidden/>
+              </w:rPr>
+            </w:r>
+            <w:r>
+              <w:rPr>
+                <w:noProof/>
+                <w:webHidden/>
+              </w:rPr>
+              <w:fldChar w:fldCharType="separate"/>
+            </w:r>
+            <w:r>
+              <w:rPr>
+                <w:noProof/>
+                <w:webHidden/>
+              </w:rPr>
+              <w:t>2</w:t>
+            </w:r>
+            <w:r>
+              <w:rPr>
+                <w:noProof/>
+                <w:webHidden/>
+              </w:rPr>
+              <w:fldChar w:fldCharType="end"/>
+            </w:r>
+          </w:hyperlink>
+        </w:p>
+        <w:p>
+          <w:pPr>
+            <w:pStyle w:val="TOC1"/>
+            <w:rPr>
+              <w:noProof/>
+              <w:kern w:val="2"/>
+              <w:sz w:val="24"/>
+              <w:szCs w:val="24"/>
+              <w:lang w:val="en-ZA" w:eastAsia="en-ZA"/>
+              <w14:ligatures w14:val="standardContextual"/>
+            </w:rPr>
+          </w:pPr>
+          <w:hyperlink w:anchor="_Toc227574466" w:history="1">
             <w:r>
               <w:rPr>
                 <w:rStyle w:val="Hyperlink"/>
@@ -218,7 +362,7 @@
                 <w:noProof/>
                 <w:webHidden/>
               </w:rPr>
-              <w:instrText xml:space="preserve"> PAGEREF _Toc230720645 \h </w:instrText>
+              <w:instrText xml:space="preserve"> PAGEREF _Toc227574466 \h </w:instrText>
             </w:r>
             <w:r>
               <w:rPr>
@@ -264,7 +408,7 @@
               <w14:ligatures w14:val="standardContextual"/>
             </w:rPr>
           </w:pPr>
-          <w:hyperlink w:anchor="_Toc230720646" w:history="1">
+          <w:hyperlink w:anchor="_Toc227574467" w:history="1">
             <w:r>
               <w:rPr>
                 <w:rStyle w:val="Hyperlink"/>
@@ -292,7 +436,7 @@
                 <w:noProof/>
                 <w:webHidden/>
               </w:rPr>
-              <w:instrText xml:space="preserve"> PAGEREF _Toc230720646 \h </w:instrText>
+              <w:instrText xml:space="preserve"> PAGEREF _Toc227574467 \h </w:instrText>
             </w:r>
             <w:r>
               <w:rPr>
@@ -338,7 +482,7 @@
               <w14:ligatures w14:val="standardContextual"/>
             </w:rPr>
           </w:pPr>
-          <w:hyperlink w:anchor="_Toc230720647" w:history="1">
+          <w:hyperlink w:anchor="_Toc227574468" w:history="1">
             <w:r>
               <w:rPr>
                 <w:rStyle w:val="Hyperlink"/>
@@ -366,7 +510,7 @@
                 <w:noProof/>
                 <w:webHidden/>
               </w:rPr>
-              <w:instrText xml:space="preserve"> PAGEREF _Toc230720647 \h </w:instrText>
+              <w:instrText xml:space="preserve"> PAGEREF _Toc227574468 \h </w:instrText>
             </w:r>
             <w:r>
               <w:rPr>
@@ -412,7 +556,7 @@
               <w14:ligatures w14:val="standardContextual"/>
             </w:rPr>
           </w:pPr>
-          <w:hyperlink w:anchor="_Toc230720648" w:history="1">
+          <w:hyperlink w:anchor="_Toc227574469" w:history="1">
             <w:r>
               <w:rPr>
                 <w:rStyle w:val="Hyperlink"/>
@@ -440,7 +584,226 @@
                 <w:noProof/>
                 <w:webHidden/>
               </w:rPr>
-              <w:instrText xml:space="preserve"> PAGEREF _Toc230720648 \h </w:instrText>
+              <w:instrText xml:space="preserve"> PAGEREF _Toc227574469 \h </w:instrText>
+            </w:r>
+            <w:r>
+              <w:rPr>
+                <w:noProof/>
+                <w:webHidden/>
+              </w:rPr>
+            </w:r>
+            <w:r>
+              <w:rPr>
+                <w:noProof/>
+                <w:webHidden/>
+              </w:rPr>
+              <w:fldChar w:fldCharType="separate"/>
+            </w:r>
+            <w:r>
+              <w:rPr>
+                <w:noProof/>
+                <w:webHidden/>
+              </w:rPr>
+              <w:t>3</w:t>
+            </w:r>
+            <w:r>
+              <w:rPr>
+                <w:noProof/>
+                <w:webHidden/>
+              </w:rPr>
+              <w:fldChar w:fldCharType="end"/>
+            </w:r>
+          </w:hyperlink>
+        </w:p>
+        <w:p>
+          <w:pPr>
+            <w:pStyle w:val="TOC2"/>
+            <w:tabs>
+              <w:tab w:val="right" w:leader="dot" w:pos="8630"/>
+            </w:tabs>
+            <w:rPr>
+              <w:noProof/>
+              <w:kern w:val="2"/>
+              <w:sz w:val="24"/>
+              <w:szCs w:val="24"/>
+              <w:lang w:val="en-ZA" w:eastAsia="en-ZA"/>
+              <w14:ligatures w14:val="standardContextual"/>
+            </w:rPr>
+          </w:pPr>
+          <w:hyperlink w:anchor="_Toc227574470" w:history="1">
+            <w:r>
+              <w:rPr>
+                <w:rStyle w:val="Hyperlink"/>
+                <w:rFonts w:ascii="Aptos" w:hAnsi="Aptos"/>
+                <w:noProof/>
+              </w:rPr>
+              <w:t>4. Features and Functionality                                                                                                                              A homepage, menu page, contact page, about us page, gallery page, and online ordering system will all be part of the website. Promotions are extra features.</w:t>
+            </w:r>
+            <w:r>
+              <w:rPr>
+                <w:noProof/>
+                <w:webHidden/>
+              </w:rPr>
+              <w:tab/>
+            </w:r>
+            <w:r>
+              <w:rPr>
+                <w:noProof/>
+                <w:webHidden/>
+              </w:rPr>
+              <w:fldChar w:fldCharType="begin"/>
+            </w:r>
+            <w:r>
+              <w:rPr>
+                <w:noProof/>
+                <w:webHidden/>
+              </w:rPr>
+              <w:instrText xml:space="preserve"> PAGEREF _Toc227574470 \h </w:instrText>
+            </w:r>
+            <w:r>
+              <w:rPr>
+                <w:noProof/>
+                <w:webHidden/>
+              </w:rPr>
+            </w:r>
+            <w:r>
+              <w:rPr>
+                <w:noProof/>
+                <w:webHidden/>
+              </w:rPr>
+              <w:fldChar w:fldCharType="separate"/>
+            </w:r>
+            <w:r>
+              <w:rPr>
+                <w:noProof/>
+                <w:webHidden/>
+              </w:rPr>
+              <w:t>3</w:t>
+            </w:r>
+            <w:r>
+              <w:rPr>
+                <w:noProof/>
+                <w:webHidden/>
+              </w:rPr>
+              <w:fldChar w:fldCharType="end"/>
+            </w:r>
+          </w:hyperlink>
+        </w:p>
+        <w:p>
+          <w:pPr>
+            <w:pStyle w:val="TOC1"/>
+            <w:rPr>
+              <w:noProof/>
+              <w:kern w:val="2"/>
+              <w:sz w:val="24"/>
+              <w:szCs w:val="24"/>
+              <w:lang w:val="en-ZA" w:eastAsia="en-ZA"/>
+              <w14:ligatures w14:val="standardContextual"/>
+            </w:rPr>
+          </w:pPr>
+          <w:hyperlink w:anchor="_Toc227574471" w:history="1">
+            <w:r>
+              <w:rPr>
+                <w:rStyle w:val="Hyperlink"/>
+                <w:rFonts w:ascii="Aptos" w:hAnsi="Aptos"/>
+                <w:noProof/>
+              </w:rPr>
+              <w:t>5. Design and UX                                                                                                                                                 Warm colors like cream and brown will be used in the design to represent the company identity. The design will be straightforward, tidy, and easy to use. The navigation will be responsive to mobile devices and easy to use.</w:t>
+            </w:r>
+            <w:r>
+              <w:rPr>
+                <w:noProof/>
+                <w:webHidden/>
+              </w:rPr>
+              <w:tab/>
+            </w:r>
+            <w:r>
+              <w:rPr>
+                <w:noProof/>
+                <w:webHidden/>
+              </w:rPr>
+              <w:fldChar w:fldCharType="begin"/>
+            </w:r>
+            <w:r>
+              <w:rPr>
+                <w:noProof/>
+                <w:webHidden/>
+              </w:rPr>
+              <w:instrText xml:space="preserve"> PAGEREF _Toc227574471 \h </w:instrText>
+            </w:r>
+            <w:r>
+              <w:rPr>
+                <w:noProof/>
+                <w:webHidden/>
+              </w:rPr>
+            </w:r>
+            <w:r>
+              <w:rPr>
+                <w:noProof/>
+                <w:webHidden/>
+              </w:rPr>
+              <w:fldChar w:fldCharType="separate"/>
+            </w:r>
+            <w:r>
+              <w:rPr>
+                <w:noProof/>
+                <w:webHidden/>
+              </w:rPr>
+              <w:t>3</w:t>
+            </w:r>
+            <w:r>
+              <w:rPr>
+                <w:noProof/>
+                <w:webHidden/>
+              </w:rPr>
+              <w:fldChar w:fldCharType="end"/>
+            </w:r>
+          </w:hyperlink>
+        </w:p>
+        <w:p>
+          <w:pPr>
+            <w:pStyle w:val="TOC2"/>
+            <w:tabs>
+              <w:tab w:val="right" w:leader="dot" w:pos="8630"/>
+            </w:tabs>
+            <w:rPr>
+              <w:noProof/>
+              <w:kern w:val="2"/>
+              <w:sz w:val="24"/>
+              <w:szCs w:val="24"/>
+              <w:lang w:val="en-ZA" w:eastAsia="en-ZA"/>
+              <w14:ligatures w14:val="standardContextual"/>
+            </w:rPr>
+          </w:pPr>
+          <w:hyperlink w:anchor="_Toc227574472" w:history="1">
+            <w:r>
+              <w:rPr>
+                <w:rStyle w:val="Hyperlink"/>
+                <w:rFonts w:ascii="Aptos" w:hAnsi="Aptos"/>
+                <w:noProof/>
+              </w:rPr>
+              <w:t>6. Wireframe</w:t>
+            </w:r>
+            <w:r>
+              <w:rPr>
+                <w:noProof/>
+                <w:webHidden/>
+              </w:rPr>
+              <w:tab/>
+            </w:r>
+            <w:r>
+              <w:rPr>
+                <w:noProof/>
+                <w:webHidden/>
+              </w:rPr>
+              <w:fldChar w:fldCharType="begin"/>
+            </w:r>
+            <w:r>
+              <w:rPr>
+                <w:noProof/>
+                <w:webHidden/>
+              </w:rPr>
+              <w:instrText xml:space="preserve"> PAGEREF _Toc227574472 \h </w:instrText>
             </w:r>
             <w:r>
               <w:rPr>
@@ -486,13 +849,14 @@
               <w14:ligatures w14:val="standardContextual"/>
             </w:rPr>
           </w:pPr>
-          <w:hyperlink w:anchor="_Toc230720649" w:history="1">
+          <w:hyperlink w:anchor="_Toc227574473" w:history="1">
             <w:r>
               <w:rPr>
                 <w:rStyle w:val="Hyperlink"/>
+                <w:rFonts w:ascii="Aptos" w:hAnsi="Aptos"/>
                 <w:noProof/>
               </w:rPr>
-              <w:t>4. Features and Functionality</w:t>
+              <w:t>7. Technical Requirements                                                                                                                                  HTML will be used in the construction of the website.</w:t>
             </w:r>
             <w:r>
               <w:rPr>
@@ -513,7 +877,7 @@
                 <w:noProof/>
                 <w:webHidden/>
               </w:rPr>
-              <w:instrText xml:space="preserve"> PAGEREF _Toc230720649 \h </w:instrText>
+              <w:instrText xml:space="preserve"> PAGEREF _Toc227574473 \h </w:instrText>
             </w:r>
             <w:r>
               <w:rPr>
@@ -559,13 +923,14 @@
               <w14:ligatures w14:val="standardContextual"/>
             </w:rPr>
           </w:pPr>
-          <w:hyperlink w:anchor="_Toc230720650" w:history="1">
+          <w:hyperlink w:anchor="_Toc227574474" w:history="1">
             <w:r>
               <w:rPr>
                 <w:rStyle w:val="Hyperlink"/>
+                <w:rFonts w:ascii="Aptos" w:hAnsi="Aptos"/>
                 <w:noProof/>
               </w:rPr>
-              <w:t>5. Design and UX</w:t>
+              <w:t>8. Timeline</w:t>
             </w:r>
             <w:r>
               <w:rPr>
@@ -586,7 +951,7 @@
                 <w:noProof/>
                 <w:webHidden/>
               </w:rPr>
-              <w:instrText xml:space="preserve"> PAGEREF _Toc230720650 \h </w:instrText>
+              <w:instrText xml:space="preserve"> PAGEREF _Toc227574474 \h </w:instrText>
             </w:r>
             <w:r>
               <w:rPr>
@@ -632,14 +997,14 @@
               <w14:ligatures w14:val="standardContextual"/>
             </w:rPr>
           </w:pPr>
-          <w:hyperlink w:anchor="_Toc230720651" w:history="1">
+          <w:hyperlink w:anchor="_Toc227574475" w:history="1">
             <w:r>
               <w:rPr>
                 <w:rStyle w:val="Hyperlink"/>
                 <w:rFonts w:ascii="Aptos" w:hAnsi="Aptos"/>
                 <w:noProof/>
               </w:rPr>
-              <w:t>6. Wireframe</w:t>
+              <w:t>9. Budget</w:t>
             </w:r>
             <w:r>
               <w:rPr>
@@ -660,7 +1025,7 @@
                 <w:noProof/>
                 <w:webHidden/>
               </w:rPr>
-              <w:instrText xml:space="preserve"> PAGEREF _Toc230720651 \h </w:instrText>
+              <w:instrText xml:space="preserve"> PAGEREF _Toc227574475 \h </w:instrText>
             </w:r>
             <w:r>
               <w:rPr>
@@ -693,10 +1058,7 @@
         </w:p>
         <w:p>
           <w:pPr>
-            <w:pStyle w:val="TOC2"/>
-            <w:tabs>
-              <w:tab w:val="right" w:leader="dot" w:pos="8630"/>
-            </w:tabs>
+            <w:pStyle w:val="TOC1"/>
             <w:rPr>
               <w:noProof/>
               <w:kern w:val="2"/>
@@ -706,13 +1068,15 @@
               <w14:ligatures w14:val="standardContextual"/>
             </w:rPr>
           </w:pPr>
-          <w:hyperlink w:anchor="_Toc230720652" w:history="1">
+          <w:hyperlink w:anchor="_Toc227574476" w:history="1">
             <w:r>
               <w:rPr>
                 <w:rStyle w:val="Hyperlink"/>
+                <w:rFonts w:ascii="Aptos" w:hAnsi="Aptos"/>
                 <w:noProof/>
+                <w:lang w:val="en-ZA"/>
               </w:rPr>
-              <w:t>7. Technical Requirements</w:t>
+              <w:t>References</w:t>
             </w:r>
             <w:r>
               <w:rPr>
@@ -733,155 +1097,7 @@
                 <w:noProof/>
                 <w:webHidden/>
               </w:rPr>
-              <w:instrText xml:space="preserve"> PAGEREF _Toc230720652 \h </w:instrText>
-            </w:r>
-            <w:r>
-              <w:rPr>
-                <w:noProof/>
-                <w:webHidden/>
-              </w:rPr>
-            </w:r>
-            <w:r>
-              <w:rPr>
-                <w:noProof/>
-                <w:webHidden/>
-              </w:rPr>
-              <w:fldChar w:fldCharType="separate"/>
-            </w:r>
-            <w:r>
-              <w:rPr>
-                <w:noProof/>
-                <w:webHidden/>
-              </w:rPr>
-              <w:t>5</w:t>
-            </w:r>
-            <w:r>
-              <w:rPr>
-                <w:noProof/>
-                <w:webHidden/>
-              </w:rPr>
-              <w:fldChar w:fldCharType="end"/>
-            </w:r>
-          </w:hyperlink>
-        </w:p>
-        <w:p>
-          <w:pPr>
-            <w:pStyle w:val="TOC2"/>
-            <w:tabs>
-              <w:tab w:val="right" w:leader="dot" w:pos="8630"/>
-            </w:tabs>
-            <w:rPr>
-              <w:noProof/>
-              <w:kern w:val="2"/>
-              <w:sz w:val="24"/>
-              <w:szCs w:val="24"/>
-              <w:lang w:val="en-ZA" w:eastAsia="en-ZA"/>
-              <w14:ligatures w14:val="standardContextual"/>
-            </w:rPr>
-          </w:pPr>
-          <w:hyperlink w:anchor="_Toc230720653" w:history="1">
-            <w:r>
-              <w:rPr>
-                <w:rStyle w:val="Hyperlink"/>
-                <w:rFonts w:ascii="Aptos" w:hAnsi="Aptos"/>
-                <w:noProof/>
-              </w:rPr>
-              <w:t>8. Timeline</w:t>
-            </w:r>
-            <w:r>
-              <w:rPr>
-                <w:noProof/>
-                <w:webHidden/>
-              </w:rPr>
-              <w:tab/>
-            </w:r>
-            <w:r>
-              <w:rPr>
-                <w:noProof/>
-                <w:webHidden/>
-              </w:rPr>
-              <w:fldChar w:fldCharType="begin"/>
-            </w:r>
-            <w:r>
-              <w:rPr>
-                <w:noProof/>
-                <w:webHidden/>
-              </w:rPr>
-              <w:instrText xml:space="preserve"> PAGEREF _Toc230720653 \h </w:instrText>
-            </w:r>
-            <w:r>
-              <w:rPr>
-                <w:noProof/>
-                <w:webHidden/>
-              </w:rPr>
-            </w:r>
-            <w:r>
-              <w:rPr>
-                <w:noProof/>
-                <w:webHidden/>
-              </w:rPr>
-              <w:fldChar w:fldCharType="separate"/>
-            </w:r>
-            <w:r>
-              <w:rPr>
-                <w:noProof/>
-                <w:webHidden/>
-              </w:rPr>
-              <w:t>5</w:t>
-            </w:r>
-            <w:r>
-              <w:rPr>
-                <w:noProof/>
-                <w:webHidden/>
-              </w:rPr>
-              <w:fldChar w:fldCharType="end"/>
-            </w:r>
-          </w:hyperlink>
-        </w:p>
-        <w:p>
-          <w:pPr>
-            <w:pStyle w:val="TOC2"/>
-            <w:tabs>
-              <w:tab w:val="right" w:leader="dot" w:pos="8630"/>
-            </w:tabs>
-            <w:rPr>
-              <w:noProof/>
-              <w:kern w:val="2"/>
-              <w:sz w:val="24"/>
-              <w:szCs w:val="24"/>
-              <w:lang w:val="en-ZA" w:eastAsia="en-ZA"/>
-              <w14:ligatures w14:val="standardContextual"/>
-            </w:rPr>
-          </w:pPr>
-          <w:hyperlink w:anchor="_Toc230720654" w:history="1">
-            <w:r>
-              <w:rPr>
-                <w:rStyle w:val="Hyperlink"/>
-                <w:rFonts w:ascii="Aptos" w:hAnsi="Aptos"/>
-                <w:noProof/>
-              </w:rPr>
-              <w:t>9. Budget</w:t>
-            </w:r>
-            <w:r>
-              <w:rPr>
-                <w:noProof/>
-                <w:webHidden/>
-              </w:rPr>
-              <w:tab/>
-            </w:r>
-            <w:r>
-              <w:rPr>
-                <w:noProof/>
-                <w:webHidden/>
-              </w:rPr>
-              <w:fldChar w:fldCharType="begin"/>
-            </w:r>
-            <w:r>
-              <w:rPr>
-                <w:noProof/>
-                <w:webHidden/>
-              </w:rPr>
-              <w:instrText xml:space="preserve"> PAGEREF _Toc230720654 \h </w:instrText>
+              <w:instrText xml:space="preserve"> PAGEREF _Toc227574476 \h </w:instrText>
             </w:r>
             <w:r>
               <w:rPr>
@@ -957,43 +1173,9 @@
     </w:p>
     <w:p>
       <w:pPr>
+        <w:spacing w:line="360" w:lineRule="auto"/>
         <w:rPr>
           <w:lang w:val="en-ZA"/>
-        </w:rPr>
-      </w:pPr>
-    </w:p>
-    <w:p>
-      <w:pPr>
-        <w:rPr>
-          <w:rFonts w:ascii="Aptos" w:hAnsi="Aptos"/>
-        </w:rPr>
-      </w:pPr>
-    </w:p>
-    <w:p>
-      <w:pPr>
-        <w:rPr>
-          <w:rFonts w:ascii="Aptos" w:hAnsi="Aptos"/>
-        </w:rPr>
-      </w:pPr>
-    </w:p>
-    <w:p>
-      <w:pPr>
-        <w:rPr>
-          <w:rFonts w:ascii="Aptos" w:hAnsi="Aptos"/>
-        </w:rPr>
-      </w:pPr>
-    </w:p>
-    <w:p>
-      <w:pPr>
-        <w:rPr>
-          <w:rFonts w:ascii="Aptos" w:hAnsi="Aptos"/>
-        </w:rPr>
-      </w:pPr>
-    </w:p>
-    <w:p>
-      <w:pPr>
-        <w:rPr>
-          <w:rFonts w:ascii="Aptos" w:hAnsi="Aptos"/>
         </w:rPr>
       </w:pPr>
     </w:p>
@@ -1007,7 +1189,7 @@
           <w:szCs w:val="22"/>
         </w:rPr>
       </w:pPr>
-      <w:bookmarkStart w:id="0" w:name="_Toc230720645"/>
+      <w:bookmarkStart w:id="1" w:name="_Toc227574466"/>
       <w:r>
         <w:rPr>
           <w:rFonts w:ascii="Aptos" w:hAnsi="Aptos"/>
@@ -1017,7 +1199,7 @@
         <w:lastRenderedPageBreak/>
         <w:t>Proposal 1: Urban Brew Coffee Website</w:t>
       </w:r>
-      <w:bookmarkEnd w:id="0"/>
+      <w:bookmarkEnd w:id="1"/>
     </w:p>
     <w:p>
       <w:pPr>
@@ -1029,7 +1211,7 @@
           <w:szCs w:val="22"/>
         </w:rPr>
       </w:pPr>
-      <w:bookmarkStart w:id="1" w:name="_Toc230720646"/>
+      <w:bookmarkStart w:id="2" w:name="_Toc227574467"/>
       <w:r>
         <w:rPr>
           <w:rFonts w:ascii="Aptos" w:hAnsi="Aptos"/>
@@ -1038,7 +1220,7 @@
         </w:rPr>
         <w:t>1. Organization Overview</w:t>
       </w:r>
-      <w:bookmarkEnd w:id="1"/>
+      <w:bookmarkEnd w:id="2"/>
     </w:p>
     <w:p>
       <w:pPr>
@@ -1077,7 +1259,7 @@
           <w:szCs w:val="22"/>
         </w:rPr>
       </w:pPr>
-      <w:bookmarkStart w:id="2" w:name="_Toc230720647"/>
+      <w:bookmarkStart w:id="3" w:name="_Toc227574468"/>
       <w:r>
         <w:rPr>
           <w:rFonts w:ascii="Aptos" w:hAnsi="Aptos"/>
@@ -1086,7 +1268,7 @@
         </w:rPr>
         <w:t>2. Website Goals and Objectives</w:t>
       </w:r>
-      <w:bookmarkEnd w:id="2"/>
+      <w:bookmarkEnd w:id="3"/>
     </w:p>
     <w:p>
       <w:pPr>
@@ -1100,53 +1282,14 @@
         <w:rPr>
           <w:rFonts w:ascii="Aptos" w:hAnsi="Aptos"/>
         </w:rPr>
-        <w:t xml:space="preserve">The primary goal of the Urban Brew Coffee website is to establish a strong online presence for the business and improve customer engagement. The website aims to increase brand awareness by promoting the coffee shop’s products, services, promotions, and company values to a wider audience. </w:t>
+        <w:t>The website's objectives are to raise brand awareness, draw in new clients, and offer an online buying system. It will act as a focal point for promotions and information.</w:t>
       </w:r>
       <w:r>
         <w:rPr>
           <w:rFonts w:ascii="Aptos" w:hAnsi="Aptos"/>
         </w:rPr>
         <w:br/>
-      </w:r>
-      <w:r>
-        <w:rPr>
-          <w:rFonts w:ascii="Aptos" w:hAnsi="Aptos"/>
-        </w:rPr>
-        <w:br/>
-        <w:t>Another important objective is to provide customers with an easy and convenient online ordering experience. Customers should be able to browse the menu, view pricing, and place orders online without difficulty. The website will also improve communication between the business and customers through contact forms and social media integration.</w:t>
-      </w:r>
-      <w:r>
-        <w:rPr>
-          <w:rFonts w:ascii="Aptos" w:hAnsi="Aptos"/>
-        </w:rPr>
-        <w:br/>
-      </w:r>
-      <w:r>
-        <w:rPr>
-          <w:rFonts w:ascii="Aptos" w:hAnsi="Aptos"/>
-        </w:rPr>
-        <w:br/>
-        <w:t>The website additionally aims to improve customer satisfaction by providing a responsive and user-friendly design that functions well on desktops, tablets, and mobile devices. The business hopes to increase sales, attract new customers, and retain existing customers through an attractive and informative online platform.</w:t>
-      </w:r>
-      <w:r>
-        <w:rPr>
-          <w:rFonts w:ascii="Aptos" w:hAnsi="Aptos"/>
-        </w:rPr>
-        <w:br/>
-      </w:r>
-      <w:r>
-        <w:rPr>
-          <w:rFonts w:ascii="Aptos" w:hAnsi="Aptos"/>
-        </w:rPr>
-        <w:br/>
-        <w:t>Key Performance Indicators (KPIs) that will be used to measure success include increased website traffic, higher online order volumes, customer engagement on the website, and improved social media interaction.</w:t>
-      </w:r>
-      <w:r>
-        <w:rPr>
-          <w:rFonts w:ascii="Aptos" w:hAnsi="Aptos"/>
-          <w:lang w:val="en-ZA"/>
-        </w:rPr>
-        <w:t xml:space="preserve"> </w:t>
+        <w:t xml:space="preserve">Increased traffic, online sales, and customer interaction indicators are examples of KPIs </w:t>
       </w:r>
       <w:r>
         <w:rPr>
@@ -1166,17 +1309,16 @@
           <w:szCs w:val="22"/>
         </w:rPr>
       </w:pPr>
-      <w:bookmarkStart w:id="3" w:name="_Toc230720648"/>
+      <w:bookmarkStart w:id="4" w:name="_Toc227574469"/>
       <w:r>
         <w:rPr>
           <w:rFonts w:ascii="Aptos" w:hAnsi="Aptos"/>
           <w:sz w:val="22"/>
           <w:szCs w:val="22"/>
         </w:rPr>
-        <w:lastRenderedPageBreak/>
         <w:t>3. Current Website Analysis</w:t>
       </w:r>
-      <w:bookmarkEnd w:id="3"/>
+      <w:bookmarkEnd w:id="4"/>
     </w:p>
     <w:p>
       <w:pPr>
@@ -1200,50 +1342,76 @@
       </w:r>
     </w:p>
     <w:p>
-      <w:bookmarkStart w:id="4" w:name="_Toc230720649"/>
+      <w:pPr>
+        <w:pStyle w:val="Heading2"/>
+        <w:spacing w:line="360" w:lineRule="auto"/>
+        <w:rPr>
+          <w:rFonts w:ascii="Aptos" w:hAnsi="Aptos"/>
+          <w:sz w:val="22"/>
+          <w:szCs w:val="22"/>
+        </w:rPr>
+      </w:pPr>
+      <w:bookmarkStart w:id="5" w:name="_Toc227574470"/>
       <w:r>
         <w:rPr>
-          <w:rStyle w:val="Heading2Char"/>
+          <w:rFonts w:ascii="Aptos" w:hAnsi="Aptos"/>
+          <w:sz w:val="22"/>
+          <w:szCs w:val="22"/>
         </w:rPr>
-        <w:t>4. Features and Functionality</w:t>
+        <w:t xml:space="preserve">4. Features and Functionality                                                                                                                              </w:t>
       </w:r>
-      <w:bookmarkEnd w:id="4"/>
       <w:r>
         <w:rPr>
-          <w:rStyle w:val="Heading2Char"/>
+          <w:rFonts w:ascii="Aptos" w:eastAsiaTheme="minorEastAsia" w:hAnsi="Aptos" w:cstheme="minorBidi"/>
+          <w:b w:val="0"/>
+          <w:bCs w:val="0"/>
+          <w:color w:val="auto"/>
+          <w:sz w:val="22"/>
+          <w:szCs w:val="22"/>
         </w:rPr>
-        <w:t xml:space="preserve">                                                                                                                              </w:t>
-      </w:r>
-      <w:r>
         <w:t>A homepage, menu page, contact page, about us page, gallery page, and online ordering system will all be part of the website. Promotions are extra features.</w:t>
       </w:r>
+      <w:bookmarkEnd w:id="5"/>
     </w:p>
     <w:p>
       <w:pPr>
+        <w:pStyle w:val="Heading1"/>
+        <w:spacing w:line="360" w:lineRule="auto"/>
+        <w:rPr>
+          <w:rFonts w:ascii="Aptos" w:hAnsi="Aptos"/>
+          <w:sz w:val="22"/>
+          <w:szCs w:val="22"/>
+        </w:rPr>
+      </w:pPr>
+      <w:bookmarkStart w:id="6" w:name="_Toc227574471"/>
+      <w:r>
+        <w:rPr>
+          <w:rFonts w:ascii="Aptos" w:hAnsi="Aptos"/>
+          <w:sz w:val="22"/>
+          <w:szCs w:val="22"/>
+        </w:rPr>
+        <w:t xml:space="preserve">5. Design and UX                                                                                                                                                 </w:t>
+      </w:r>
+      <w:r>
+        <w:rPr>
+          <w:rFonts w:ascii="Aptos" w:eastAsiaTheme="minorEastAsia" w:hAnsi="Aptos" w:cstheme="minorBidi"/>
+          <w:b w:val="0"/>
+          <w:bCs w:val="0"/>
+          <w:color w:val="auto"/>
+          <w:sz w:val="22"/>
+          <w:szCs w:val="22"/>
+        </w:rPr>
+        <w:t>Warm colors like cream and brown will be used in the design to represent the company identity. The design will be straightforward, tidy, and easy to use. The navigation will be responsive to mobile devices and easy to use.</w:t>
+      </w:r>
+      <w:bookmarkEnd w:id="6"/>
+    </w:p>
+    <w:p>
+      <w:pPr>
+        <w:spacing w:line="360" w:lineRule="auto"/>
         <w:rPr>
           <w:rFonts w:ascii="Aptos" w:hAnsi="Aptos"/>
         </w:rPr>
       </w:pPr>
-      <w:bookmarkStart w:id="5" w:name="_Toc230720650"/>
-      <w:r>
-        <w:rPr>
-          <w:rStyle w:val="Heading2Char"/>
-        </w:rPr>
-        <w:t>5. Design and UX</w:t>
-      </w:r>
-      <w:bookmarkEnd w:id="5"/>
-      <w:r>
-        <w:rPr>
-          <w:rStyle w:val="Heading2Char"/>
-        </w:rPr>
-        <w:t xml:space="preserve">                                                                                                                                                 </w:t>
-      </w:r>
-      <w:r>
-        <w:rPr>
-          <w:rFonts w:ascii="Aptos" w:hAnsi="Aptos"/>
-        </w:rPr>
-        <w:t>Warm colors like cream and brown will be used in the design to represent the company identity. The design will be straightforward, tidy, and easy to use. The navigation will be responsive to mobile devices and easy to use.</w:t>
-      </w:r>
     </w:p>
     <w:p>
       <w:pPr>
@@ -1255,16 +1423,17 @@
           <w:szCs w:val="22"/>
         </w:rPr>
       </w:pPr>
-      <w:bookmarkStart w:id="6" w:name="_Toc230720651"/>
+      <w:bookmarkStart w:id="7" w:name="_Toc227574472"/>
       <w:r>
         <w:rPr>
           <w:rFonts w:ascii="Aptos" w:hAnsi="Aptos"/>
           <w:sz w:val="22"/>
           <w:szCs w:val="22"/>
         </w:rPr>
+        <w:lastRenderedPageBreak/>
         <w:t>6. Wireframe</w:t>
       </w:r>
-      <w:bookmarkEnd w:id="6"/>
+      <w:bookmarkEnd w:id="7"/>
     </w:p>
     <w:p>
       <w:pPr>
@@ -1317,40 +1486,90 @@
     </w:p>
     <w:p>
       <w:pPr>
+        <w:pStyle w:val="Heading2"/>
+        <w:spacing w:line="360" w:lineRule="auto"/>
         <w:rPr>
-          <w:rStyle w:val="Heading2Char"/>
+          <w:rFonts w:ascii="Aptos" w:hAnsi="Aptos"/>
+          <w:sz w:val="22"/>
+          <w:szCs w:val="22"/>
         </w:rPr>
       </w:pPr>
+      <w:bookmarkStart w:id="8" w:name="_Toc227574473"/>
+      <w:r>
+        <w:rPr>
+          <w:rFonts w:ascii="Aptos" w:hAnsi="Aptos"/>
+          <w:sz w:val="22"/>
+          <w:szCs w:val="22"/>
+        </w:rPr>
+        <w:t xml:space="preserve">7. Technical Requirements                                                                                                                                  </w:t>
+      </w:r>
+      <w:r>
+        <w:rPr>
+          <w:rFonts w:ascii="Aptos" w:eastAsiaTheme="minorEastAsia" w:hAnsi="Aptos" w:cstheme="minorBidi"/>
+          <w:b w:val="0"/>
+          <w:bCs w:val="0"/>
+          <w:color w:val="auto"/>
+          <w:sz w:val="22"/>
+          <w:szCs w:val="22"/>
+        </w:rPr>
+        <w:t>HTML will be used in the construction of the website.</w:t>
+      </w:r>
+      <w:bookmarkEnd w:id="8"/>
     </w:p>
     <w:p>
       <w:pPr>
+        <w:pStyle w:val="Heading2"/>
+        <w:spacing w:line="360" w:lineRule="auto"/>
+        <w:rPr>
+          <w:rFonts w:ascii="Aptos" w:hAnsi="Aptos"/>
+          <w:sz w:val="22"/>
+          <w:szCs w:val="22"/>
+        </w:rPr>
+      </w:pPr>
+      <w:bookmarkStart w:id="9" w:name="_Toc227574474"/>
+      <w:r>
+        <w:rPr>
+          <w:rFonts w:ascii="Aptos" w:hAnsi="Aptos"/>
+          <w:sz w:val="22"/>
+          <w:szCs w:val="22"/>
+        </w:rPr>
+        <w:t>8. Timeline</w:t>
+      </w:r>
+      <w:bookmarkEnd w:id="9"/>
+    </w:p>
+    <w:p>
+      <w:pPr>
+        <w:spacing w:line="360" w:lineRule="auto"/>
         <w:rPr>
           <w:rFonts w:ascii="Aptos" w:hAnsi="Aptos"/>
         </w:rPr>
       </w:pPr>
-      <w:bookmarkStart w:id="7" w:name="_Toc230720652"/>
       <w:r>
         <w:rPr>
-          <w:rStyle w:val="Heading2Char"/>
+          <w:rFonts w:ascii="Aptos" w:hAnsi="Aptos"/>
         </w:rPr>
-        <w:lastRenderedPageBreak/>
-        <w:t>7. Technical Requirements</w:t>
+        <w:t>Week 1–2: Planning and design</w:t>
       </w:r>
-      <w:bookmarkEnd w:id="7"/>
       <w:r>
         <w:rPr>
-          <w:rStyle w:val="Heading2Char"/>
+          <w:rFonts w:ascii="Aptos" w:hAnsi="Aptos"/>
         </w:rPr>
-        <w:t xml:space="preserve">                                                                                                                                  </w:t>
+        <w:br/>
+        <w:t>Week 3–4: Development</w:t>
       </w:r>
       <w:r>
-        <w:t>HTML</w:t>
+        <w:rPr>
+          <w:rFonts w:ascii="Aptos" w:hAnsi="Aptos"/>
+        </w:rPr>
+        <w:br/>
+        <w:t>Week 5: Testing</w:t>
       </w:r>
       <w:r>
-        <w:t>, CSS</w:t>
-      </w:r>
-      <w:r>
-        <w:t xml:space="preserve"> will be used in the construction of the website.</w:t>
+        <w:rPr>
+          <w:rFonts w:ascii="Aptos" w:hAnsi="Aptos"/>
+        </w:rPr>
+        <w:br/>
+        <w:t>Week 6: Launch</w:t>
       </w:r>
     </w:p>
     <w:p>
@@ -1363,163 +1582,7 @@
           <w:szCs w:val="22"/>
         </w:rPr>
       </w:pPr>
-      <w:bookmarkStart w:id="8" w:name="_Toc230720653"/>
-      <w:r>
-        <w:rPr>
-          <w:rFonts w:ascii="Aptos" w:hAnsi="Aptos"/>
-          <w:sz w:val="22"/>
-          <w:szCs w:val="22"/>
-        </w:rPr>
-        <w:t>8. Timeline</w:t>
-      </w:r>
-      <w:bookmarkEnd w:id="8"/>
-    </w:p>
-    <w:p>
-      <w:pPr>
-        <w:rPr>
-          <w:b/>
-          <w:bCs/>
-        </w:rPr>
-      </w:pPr>
-      <w:r>
-        <w:rPr>
-          <w:b/>
-          <w:bCs/>
-        </w:rPr>
-        <w:t>Week 1:</w:t>
-      </w:r>
-    </w:p>
-    <w:p>
-      <w:r>
-        <w:t>Conduct research on similar coffee shop websites, gather business requirements, and create initial wireframes and design ideas.</w:t>
-      </w:r>
-    </w:p>
-    <w:p>
-      <w:pPr>
-        <w:rPr>
-          <w:b/>
-          <w:bCs/>
-        </w:rPr>
-      </w:pPr>
-      <w:r>
-        <w:rPr>
-          <w:b/>
-          <w:bCs/>
-        </w:rPr>
-        <w:t>Week 2:</w:t>
-      </w:r>
-    </w:p>
-    <w:p>
-      <w:r>
-        <w:t xml:space="preserve">Plan the website structure, create the sitemap, </w:t>
-      </w:r>
-      <w:r>
-        <w:t>organize</w:t>
-      </w:r>
-      <w:r>
-        <w:t xml:space="preserve"> content, and prepare images and branding materials for the website.</w:t>
-      </w:r>
-    </w:p>
-    <w:p>
-      <w:pPr>
-        <w:rPr>
-          <w:b/>
-          <w:bCs/>
-        </w:rPr>
-      </w:pPr>
-      <w:r>
-        <w:rPr>
-          <w:b/>
-          <w:bCs/>
-        </w:rPr>
-        <w:t>Week 3:</w:t>
-      </w:r>
-    </w:p>
-    <w:p>
-      <w:r>
-        <w:t>Develop the HTML structure for all web pages including the homepage, menu page, gallery page, about us page, online ordering page, and contact page.</w:t>
-      </w:r>
-    </w:p>
-    <w:p>
-      <w:pPr>
-        <w:rPr>
-          <w:b/>
-          <w:bCs/>
-        </w:rPr>
-      </w:pPr>
-      <w:r>
-        <w:rPr>
-          <w:b/>
-          <w:bCs/>
-        </w:rPr>
-        <w:t>Week 4:</w:t>
-      </w:r>
-    </w:p>
-    <w:p>
-      <w:r>
-        <w:t xml:space="preserve">Apply CSS styling to improve the visual appearance of the website, including typography, </w:t>
-      </w:r>
-      <w:r>
-        <w:t>colors</w:t>
-      </w:r>
-      <w:r>
-        <w:t>, layout design, navigation menus, and responsiveness.</w:t>
-      </w:r>
-    </w:p>
-    <w:p>
-      <w:pPr>
-        <w:rPr>
-          <w:b/>
-          <w:bCs/>
-        </w:rPr>
-      </w:pPr>
-      <w:r>
-        <w:rPr>
-          <w:b/>
-          <w:bCs/>
-        </w:rPr>
-        <w:t>Week 5:</w:t>
-      </w:r>
-    </w:p>
-    <w:p>
-      <w:r>
-        <w:t>Test the website on different devices and screen sizes to ensure responsiveness and usability. Fix bugs, broken links, and layout issues.</w:t>
-      </w:r>
-    </w:p>
-    <w:p>
-      <w:pPr>
-        <w:rPr>
-          <w:b/>
-          <w:bCs/>
-        </w:rPr>
-      </w:pPr>
-      <w:r>
-        <w:rPr>
-          <w:b/>
-          <w:bCs/>
-        </w:rPr>
-        <w:t>Week 6:</w:t>
-      </w:r>
-    </w:p>
-    <w:p>
-      <w:r>
-        <w:t>Finalize</w:t>
-      </w:r>
-      <w:r>
-        <w:t xml:space="preserve"> the website, upload all files to GitHub, deploy the website online, and prepare documentation including the README file and changelog.</w:t>
-      </w:r>
-    </w:p>
-    <w:p>
-      <w:pPr>
-        <w:pStyle w:val="Heading2"/>
-        <w:spacing w:line="360" w:lineRule="auto"/>
-        <w:rPr>
-          <w:rFonts w:ascii="Aptos" w:hAnsi="Aptos"/>
-          <w:sz w:val="22"/>
-          <w:szCs w:val="22"/>
-        </w:rPr>
-      </w:pPr>
-      <w:bookmarkStart w:id="9" w:name="_Toc230720654"/>
+      <w:bookmarkStart w:id="10" w:name="_Toc227574475"/>
       <w:r>
         <w:rPr>
           <w:rFonts w:ascii="Aptos" w:hAnsi="Aptos"/>
@@ -1528,117 +1591,20 @@
         </w:rPr>
         <w:t>9. Budget</w:t>
       </w:r>
-      <w:bookmarkEnd w:id="9"/>
-    </w:p>
-    <w:p>
-      <w:r>
-        <w:t>The estimated budget for the Urban Brew Coffee website project includes development, hosting, maintenance, and future improvements.</w:t>
-      </w:r>
+      <w:bookmarkEnd w:id="10"/>
     </w:p>
     <w:p>
       <w:pPr>
+        <w:spacing w:line="360" w:lineRule="auto"/>
         <w:rPr>
-          <w:b/>
-          <w:bCs/>
+          <w:rFonts w:ascii="Aptos" w:hAnsi="Aptos"/>
         </w:rPr>
       </w:pPr>
       <w:r>
         <w:rPr>
-          <w:b/>
-          <w:bCs/>
+          <w:rFonts w:ascii="Aptos" w:hAnsi="Aptos"/>
         </w:rPr>
-        <w:t>Website Development:</w:t>
-      </w:r>
-    </w:p>
-    <w:p>
-      <w:r>
-        <w:t>The estimated development cost is approximately R5,000. This includes planning, designing, coding, testing, and implementing the website.</w:t>
-      </w:r>
-    </w:p>
-    <w:p>
-      <w:pPr>
-        <w:rPr>
-          <w:b/>
-          <w:bCs/>
-        </w:rPr>
-      </w:pPr>
-      <w:r>
-        <w:rPr>
-          <w:b/>
-          <w:bCs/>
-        </w:rPr>
-        <w:t>Domain and Hosting:</w:t>
-      </w:r>
-    </w:p>
-    <w:p>
-      <w:r>
-        <w:t>Website hosting is estimated at R1,200 per year, while domain registration is estimated at approximately R250 per year.</w:t>
-      </w:r>
-    </w:p>
-    <w:p>
-      <w:pPr>
-        <w:rPr>
-          <w:b/>
-          <w:bCs/>
-        </w:rPr>
-      </w:pPr>
-      <w:r>
-        <w:rPr>
-          <w:b/>
-          <w:bCs/>
-        </w:rPr>
-        <w:lastRenderedPageBreak/>
-        <w:t>Maintenance:</w:t>
-      </w:r>
-    </w:p>
-    <w:p>
-      <w:r>
-        <w:t>Monthly maintenance costs are estimated at R500 per month. This includes updating website content, fixing technical issues, updating images and promotions, and maintaining website security.</w:t>
-      </w:r>
-    </w:p>
-    <w:p>
-      <w:pPr>
-        <w:rPr>
-          <w:b/>
-          <w:bCs/>
-        </w:rPr>
-      </w:pPr>
-      <w:r>
-        <w:rPr>
-          <w:b/>
-          <w:bCs/>
-        </w:rPr>
-        <w:t>Marketing and Advertising:</w:t>
-      </w:r>
-    </w:p>
-    <w:p>
-      <w:r>
-        <w:t>An estimated R1,000 may be allocated towards digital marketing and social media promotions to increase traffic to the website after launch.</w:t>
-      </w:r>
-    </w:p>
-    <w:p>
-      <w:pPr>
-        <w:rPr>
-          <w:b/>
-          <w:bCs/>
-        </w:rPr>
-      </w:pPr>
-      <w:r>
-        <w:rPr>
-          <w:b/>
-          <w:bCs/>
-        </w:rPr>
-        <w:t>Contingency Costs:</w:t>
-      </w:r>
-    </w:p>
-    <w:p>
-      <w:r>
-        <w:t>An additional R500 is reserved for unexpected costs such as software tools, image editing resources, or additional website features.</w:t>
-      </w:r>
-    </w:p>
-    <w:p>
-      <w:r>
-        <w:t>The total estimated first-year cost for the website project is approximately R13,950.</w:t>
+        <w:t>Development (R5,000), hosting (R1,200/year), and maintenance (R500/month) are all included in the estimated cost.</w:t>
       </w:r>
     </w:p>
     <w:p>
@@ -1646,16 +1612,6 @@
         <w:spacing w:line="360" w:lineRule="auto"/>
         <w:rPr>
           <w:rFonts w:ascii="Aptos" w:hAnsi="Aptos"/>
-          <w:lang w:val="en-ZA"/>
-        </w:rPr>
-      </w:pPr>
-    </w:p>
-    <w:p>
-      <w:pPr>
-        <w:spacing w:line="360" w:lineRule="auto"/>
-        <w:rPr>
-          <w:rFonts w:ascii="Aptos" w:hAnsi="Aptos"/>
-          <w:lang w:val="en-ZA"/>
         </w:rPr>
       </w:pPr>
     </w:p>
@@ -1672,6 +1628,7 @@
           <w:rFonts w:ascii="Aptos" w:hAnsi="Aptos"/>
           <w:lang w:val="en-ZA"/>
         </w:rPr>
+        <w:lastRenderedPageBreak/>
         <w:t>Kotler, P. et al.</w:t>
       </w:r>
       <w:r>

</xml_diff>